<commit_message>
round-3: MR replication-focused title/abstract, negative-result framing for prognostic score, harmonise/sample-overlap details, supp material 3
</commit_message>
<xml_diff>
--- a/副课题1论文_完整版_20260914.docx
+++ b/副课题1论文_完整版_20260914.docx
@@ -13,7 +13,7 @@
           <w:b/>
           <w:sz w:val="32"/>
         </w:rPr>
-        <w:t>遗传预测的血清促甲状腺激素水平与甲状腺癌风险：孟德尔随机化、候选基因预后评分与肿瘤微环境的探索性整合分析</w:t>
+        <w:t>遗传预测的血清促甲状腺激素水平与甲状腺癌风险的孟德尔随机化重复验证与扩展研究：附候选基因评分与肿瘤微环境的探索性评估</w:t>
       </w:r>
     </w:p>
     <w:p>
@@ -68,7 +68,7 @@
           <w:b w:val="0"/>
           <w:sz w:val="22"/>
         </w:rPr>
-        <w:t>【背景】血清促甲状腺激素（TSH）水平与甲状腺癌发病风险的因果关系存在争议，且既往研究基于不同的工具变量集与结局定义结论不一。本研究以两样本孟德尔随机化（MR）为核心，联合多变量 MR（MVMR）、候选基因预后评分构建、免疫浸润与药物敏感性计算预测，对 TSH-甲状腺癌因果关联及其转化价值进行探索性评估。</w:t>
+        <w:t>【背景】血清促甲状腺激素（TSH）水平与甲状腺癌发病风险的因果关系存在争议，且既往研究基于不同的工具变量集与结局定义结论不一。本研究定位为对既往工具变量集的重复验证与扩展：以两样本孟德尔随机化（MR）为核心评估 TSH-甲状腺癌因果关联，报告完整敏感性分析；候选基因评分（含样本外负结果检验）、免疫浸润与药物敏感性计算预测作为探索性补充。</w:t>
       </w:r>
     </w:p>
     <w:p>
@@ -82,7 +82,7 @@
           <w:b w:val="0"/>
           <w:sz w:val="22"/>
         </w:rPr>
-        <w:t>【方法】基于 Zhou 等（2020）的 TSH 全基因组关联研究补充数据（99 个全基因组显著位点，LD 筛选后 70 个独立工具 SNP），以 LD r² &lt; 0.001（10000 kb）筛选独立工具变量，对甲状腺癌结局（ebi-a-GCST90018929，1054 例病例/490,920 例对照）行两样本 MR，进行异质性、水平多效性、留一法、MR-PRESSO 及 MR-RAPS 敏感性分析，并在两个独立结局中复制；以 TSH 工具 SNP 为骨架、校正 BMI 与睾酮行 MVMR（报告条件 F 统计量与条件异质性 Q，并注明弱工具限制）。将工具 SNP 映射至候选基因，在 TCGA-THY 队列（409 例）中构建探索性候选基因预后评分，在 GEO 数据集 GSE33630 行病理类型梯度验证；以 ssGSEA 评估免疫细胞相对富集，基于 GDSC2 以 oncoPredict 计算预测 198 种药物敏感性并报告交叉验证性能与置换检验结果。</w:t>
+        <w:t>【方法】基于 Zhou 等（2020）的 TSH 全基因组关联研究补充数据（99 个全基因组显著位点，LD 筛选后 70 个独立工具 SNP），以 LD r² &lt; 0.001（10000 kb）筛选独立工具变量，对甲状腺癌结局（ebi-a-GCST90018929，1054 例病例/490,920 例对照）行两样本 MR，进行异质性、水平多效性、留一法、MR-PRESSO 及 MR-RAPS 敏感性分析，并在两个独立结局中复制；以 TSH 工具 SNP 为骨架、校正 BMI 与睾酮行 MVMR（报告条件 F 统计量与条件异质性 Q，并注明弱工具限制）。将工具 SNP 映射至候选基因，在 TCGA-THY 队列（409 例）中构建探索性候选基因评分（明确报告样本外负结果），在 GEO 数据集 GSE33630 行病理类型梯度验证；以 ssGSEA 评估免疫细胞相对富集，基于 GDSC2 以 oncoPredict 计算预测 198 种药物敏感性并报告交叉验证性能与置换检验结果。</w:t>
       </w:r>
     </w:p>
     <w:p>
@@ -96,7 +96,7 @@
           <w:b w:val="0"/>
           <w:sz w:val="22"/>
         </w:rPr>
-        <w:t>【结果】两样本 MR 显示遗传预测 TSH 升高与甲状腺癌风险降低存在因果关联（主分析 IVW 随机效应 OR = 0.487，95% CI 0.335–0.709，P = 1.7×10⁻⁴，69 个有效 SNP），MR-Egger 截距检验未发现显著定向多效性（P = 0.906）；Cochran Q 检验提示工具变量间存在显著异质性（IVW Q = 279.39，df = 68，P = 1.99×10⁻²⁷，I² = 75.7%），MR-PRESSO 全局检验亦显著（P &lt; 1×10⁻⁴）并识别 4 个潜在离群 SNP；剔除离群 SNP 后随机效应 IVW 估计为 OR = 0.579（95% CI 0.452–0.741，65 个 SNP），方向与主分析一致；MR-RAPS 估计方向亦一致（OR = 0.476，P = 4.2×10⁻¹⁵）。两个复制结局方向一致（OR = 0.362，P = 6.10×10⁻⁶；OR = 0.559，P = 0.0025）。MVMR 在校正 BMI 与睾酮后 TSH 直接效应仍显著（54 SNP，OR = 0.525，95% CI 0.317–0.869，P = 0.0123，t 检验），但 BMI（条件 F = 5.66）与睾酮（条件 F = 3.38）为弱工具，该校正结果仅具探索性。由 GNG7 与 NFIA 构建的候选基因评分 C-index = 0.666（95% CI 0.559–0.774），高、低风险组生存差异显著（Log-rank P = 0.041）；Bootstrap 200 次变量选择中 GNG7 保留频率 151/200（75.5%）、NFIA 保留频率 113/200（56.5%），5×5 折重复交叉验证 C-index 均值 0.334；GSE33630 中评分呈 ATC &gt; PTC &gt; Normal 梯度（Kruskal-Wallis P = 1.75×10⁻¹²）。28 种免疫细胞的相对富集评分中 25 种组间差异显著（FDR &lt; 0.05），高风险组呈免疫激活伴耗竭特征；计算预测提示 176 种药物（88.9%）的 IC50 组间差异显著，其中高风险组对 158 种更耐药、仅 18 种更敏感；代表药物 5 折交叉验证 R² 中位数 0.350，组标签置换（500 次）显示显著药物数（176）远高于随机期望（置换中位数 0.62，P &lt; 0.002）。</w:t>
+        <w:t>【结果】两样本 MR 显示遗传预测 TSH 升高与甲状腺癌风险降低存在因果关联（主分析 IVW 随机效应 OR = 0.487，95% CI 0.335–0.709，P = 1.7×10⁻⁴，69 个有效 SNP），MR-Egger 截距检验未发现显著定向多效性（P = 0.906）；Cochran Q 检验提示工具变量间存在显著异质性（IVW Q = 279.39，df = 68，P = 1.99×10⁻²⁷，I² = 75.7%），MR-PRESSO 全局检验亦显著（P &lt; 1×10⁻⁴）并识别 4 个潜在离群 SNP；剔除离群 SNP 后随机效应 IVW 估计为 OR = 0.579（95% CI 0.452–0.741，65 个 SNP），方向与主分析一致；MR-RAPS 估计方向亦一致（OR = 0.476，P = 4.2×10⁻¹⁵）。两个复制结局方向一致（OR = 0.362，P = 6.10×10⁻⁶；OR = 0.559，P = 0.0025）。MVMR 在校正 BMI 与睾酮后 TSH 直接效应仍显著（54 SNP，OR = 0.525，95% CI 0.317–0.869，P = 0.0123，t 检验），但 BMI（条件 F = 5.66）与睾酮（条件 F = 3.38）为弱工具，该校正结果仅具探索性。由 GNG7 与 NFIA 构建的候选基因评分 C-index = 0.666（95% CI 0.559–0.774），高、低风险组生存差异显著（Log-rank P = 0.041）；Bootstrap 200 次变量选择中 GNG7 保留频率 151/200（75.5%）、NFIA 保留频率 113/200（56.5%），5×5 折重复交叉验证 C-index 均值 0.334（低于随机水平 0.5，样本外无预测能力）；GSE33630 中评分呈 ATC &gt; PTC &gt; Normal 病理类型梯度（Kruskal-Wallis P = 1.75×10⁻¹²，非生存验证）。28 种免疫细胞的相对富集评分中 25 种组间差异显著（FDR &lt; 0.05），高风险组呈免疫激活伴耗竭特征；计算预测提示 176 种药物（88.9%）的 IC50 组间差异显著，其中高风险组对 158 种更耐药、仅 18 种更敏感；代表药物 5 折交叉验证 R² 中位数 0.350，组标签置换（500 次）显示显著药物数（176）远高于随机期望（置换中位数 0.62，P &lt; 0.002）。</w:t>
       </w:r>
     </w:p>
     <w:p>
@@ -110,7 +110,7 @@
           <w:b w:val="0"/>
           <w:sz w:val="22"/>
         </w:rPr>
-        <w:t>【结论】遗传证据提示 TSH 升高对甲状腺癌发病可能具有保护作用；GNG7/NFIA 候选基因评分显示初步区分趋势但未经独立生存队列验证；免疫浸润与药物敏感性均为计算预测结果。本研究属探索性、假设生成性质，其临床价值需独立队列与实验验证。</w:t>
+        <w:t>【结论】作为重复验证与扩展研究，遗传证据再次支持 TSH 升高与甲状腺癌发病风险降低相关，但工具变量间异质性高、MVMR 受弱工具限制且无共定位证据，因果证据强度有限；GNG7/NFIA 候选基因评分经重复交叉验证显示样本外无预测能力（C-index 0.334），为负结果；免疫浸润与药物敏感性均为计算预测、假设生成性质。临床价值需独立队列与实验验证。</w:t>
       </w:r>
     </w:p>
     <w:p>
@@ -123,7 +123,7 @@
           <w:b/>
           <w:sz w:val="22"/>
         </w:rPr>
-        <w:t>【关键词】促甲状腺激素；甲状腺癌；孟德尔随机化；候选基因评分；免疫浸润；药物敏感性</w:t>
+        <w:t>【关键词】促甲状腺激素；甲状腺癌；孟德尔随机化；重复验证；样本外验证</w:t>
       </w:r>
     </w:p>
     <w:p>
@@ -178,7 +178,7 @@
           <w:b w:val="0"/>
           <w:sz w:val="22"/>
         </w:rPr>
-        <w:t>本研究以全流程重跑、真实输出为准的方式完成：（1）两样本 MR 主分析、敏感性分析与双结局复制，并补充 MR-PRESSO 校正估计、MR-RAPS 与 Steiger 方向性检验；（2）校正 BMI 与睾酮的 MVMR（报告条件 F 与条件异质性 Q 并如实标注弱工具限制）；（3）基于 MR 阳性证据将工具 SNP 映射至候选基因，在 TCGA-THY 队列构建探索性候选基因预后评分（补充 Bootstrap 变量选择频率与重复交叉验证），并在独立 GEO 队列行病理类型梯度验证；（4）免疫浸润分析与 GDSC2 药物敏感性计算预测（补充交叉验证性能与置换检验），以期为 TSH-甲状腺癌关联的临床转化提供假设生成证据。报告遵循 STROBE-MR 与 TRIPOD+AI 规范（检查表见补充材料）。</w:t>
+        <w:t>本研究定位为重复验证与扩展分析：使用 Zhou 等（2020）已发表的 TSH 工具变量集，在新的主结局与两个独立复制结局中系统评估 TSH-甲状腺癌因果关联，报告 MR-PRESSO 校正估计、MR-RAPS、Steiger 与完整异质性/多效性检验（全部数值来自脚本 A 与脚本 L 的真实 Console 输出）。在此基础上行探索性延伸：（1）校正 BMI 与睾酮的 MVMR（如实标注弱工具限制）；（2）将工具 SNP 映射至候选基因，在 TCGA-THY 构建候选基因评分，以 Bootstrap 变量选择频率与 5×5 折重复交叉验证明确报告其样本外无预测能力（负结果），GEO 队列仅行病理类型梯度（非生存）验证；（3）免疫浸润与 GDSC2 药物敏感性计算预测（报告交叉验证性能与置换检验）。报告遵循 STROBE-MR 与 TRIPOD+AI 规范（检查表见补充材料）。</w:t>
       </w:r>
     </w:p>
     <w:p>
@@ -245,7 +245,7 @@
           <w:b w:val="0"/>
           <w:sz w:val="22"/>
         </w:rPr>
-        <w:t>补充数据提供的 99 个位点均已满足 P &lt; 5×10⁻⁸；在此基础上以连锁不平衡 r² &lt; 0.001（窗口 10000 kb，EUR 参考面板）筛选出 70 个独立工具 SNP，并计算 F 统计量（F = beta²/SE²）评估弱工具偏倚（F &gt; 10 为合格）。对主结局行两样本 MR：以逆方差加权（IVW）随机效应模型为主分析，MR-Egger、加权中位数、简单众数、加权众数为补充；以 Cochran Q 检验异质性并报告 I²（I² = (Q − df)/Q × 100%）与 DerSimonian-Laird tau²，MR-Egger 截距检验水平多效性、留一法评估单一 SNP 驱动效应。MR-PRESSO（10000 次置换）检测离群 SNP，并按失真检验识别的离群索引剔除后重估随机效应与固定效应 IVW（outlier-corrected 估计），同时报告离群 SNP 的 rsID 列表；以 MR-RAPS（稳健调整轮廓评分）作为对多效性稳健的补充方法，以 Steiger 方向性检验评估因果方向的可靠性。复制结局分别重复主分析流程并报告异质性 Q、I²、MR-Egger 截距与 MR-PRESSO 全局检验。全部敏感性检验的详细数值来自脚本 A 与脚本 L 在线重跑的真实 Console 输出（2026-09-13/2026-09-14，OpenGWAS 凭据）。</w:t>
+        <w:t>补充数据提供的 99 个位点均已满足 P &lt; 5×10⁻⁸；在此基础上以连锁不平衡 r² &lt; 0.001（窗口 10000 kb，EUR 参考面板）筛选出 70 个独立工具 SNP，并计算 F 统计量（F = beta²/SE²）评估弱工具偏倚（F &gt; 10 为合格）。以 harmonise_data（action = 2）进行等位基因协调：回文 SNP 按等位基因频率判定，无法判定的回文与等位基因不匹配 SNP 予以剔除，主结局协调后余 69 个有效 SNP。暴露 GWAS（HUNT/MGI/ThyroidOmics，不含 UK Biobank）与结局 GWAS（欧洲人群）队列构成不同，但均为欧洲血统人群，无法完全排除样本重叠且未量化（见 4.7）。对主结局行两样本 MR：以逆方差加权（IVW）随机效应模型为主分析，MR-Egger、加权中位数、简单众数、加权众数为补充；以 Cochran Q 检验异质性并报告 I²（I² = (Q − df)/Q × 100%）与 DerSimonian-Laird tau²，MR-Egger 截距检验水平多效性、留一法评估单一 SNP 驱动效应。MR-PRESSO（10000 次置换）检测离群 SNP，并按失真检验识别的离群索引剔除后重估随机效应与固定效应 IVW（outlier-corrected 估计），同时报告离群 SNP 的 rsID 列表；以 MR-RAPS（稳健调整轮廓评分）作为对多效性稳健的补充方法，以 Steiger 方向性检验评估因果方向的可靠性。复制结局分别重复主分析流程并报告异质性 Q、I²、MR-Egger 截距与 MR-PRESSO 全局检验。全部敏感性检验的详细数值来自脚本 A 与脚本 L 在线重跑的真实 Console 输出（2026-09-13/2026-09-14，OpenGWAS 凭据）。</w:t>
       </w:r>
     </w:p>
     <w:p>
@@ -285,7 +285,7 @@
           <w:b/>
           <w:sz w:val="24"/>
         </w:rPr>
-        <w:t>2.4  候选基因预后评分构建与评估</w:t>
+        <w:t>2.4  候选基因评分的探索性构建（负结果检验）</w:t>
       </w:r>
     </w:p>
     <w:p>
@@ -299,7 +299,7 @@
           <w:b w:val="0"/>
           <w:sz w:val="22"/>
         </w:rPr>
-        <w:t>将 MR 工具 SNP 映射至候选基因（55 个 SNP → 60 个候选基因），在 TCGA-THY 队列（409 例，27 例复发/死亡事件，EPV ≈ 13.5）中构建探索性风险评分 riskScore = −0.0053257 × GNG7 − 0.0003788 × NFIA（基因表达量为 TPM 后 log2 转换），按中位数分为高、低风险组。GNG7 与 NFIA 的入选依据为早期分析中的单因素与多因素 Cox 回归筛选（多因素 Cox：GNG7 P = 0.072、NFIA P = 0.241，均未达传统显著性阈值，故本评分定位为探索性候选基因评分而非验证性预后模型）。为评估变量选择稳定性，补充运行 Bootstrap 200 次（每次从 409 例中有放回抽样、以同样的双基因 Cox 结构拟合）记录 GNG7/NFIA 的保留频率与系数方向；并以 5×5 折重复交叉验证评估评分 C-index 的分布（均值与范围）。评估指标：C-index（concordance 法，95% CI 采用正态近似；Bootstrap 1000 次内部验证并报告乐观校正值）、Log-rank 检验、时间依赖 ROC（survivalROC，KM 法，1/3/5 年）、3 年校准曲线（rms::calibrate，Bootstrap 1000 次，seed 20260913）、36 个月决策曲线分析（DCA）。</w:t>
+        <w:t>将 MR 工具 SNP 映射至候选基因（55 个 SNP → 60 个候选基因），在 TCGA-THY 队列（409 例，27 例复发/死亡事件，EPV ≈ 13.5）中构建探索性风险评分 riskScore = −0.0053257 × GNG7 − 0.0003788 × NFIA（基因表达量为 TPM 后 log2 转换），按中位数分为高、低风险组。GNG7 与 NFIA 的入选依据为早期分析中的单因素与多因素 Cox 回归筛选（多因素 Cox：GNG7 P = 0.072、NFIA P = 0.241，均未达传统显著性阈值，故本评分定位为探索性候选基因评分而非验证性预后模型）。为评估变量选择稳定性，补充运行 Bootstrap 200 次（每次从 409 例中有放回抽样、以同样的双基因 Cox 结构拟合）记录 GNG7/NFIA 的保留频率与系数方向；并以 5×5 折重复交叉验证评估评分 C-index 的分布（均值与范围）。评估指标：C-index（concordance 法，95% CI 采用正态近似；Bootstrap 1000 次内部验证并报告乐观校正值）、Log-rank 检验、时间依赖 ROC（survivalROC，KM 法，1/3/5 年）、3 年校准曲线（rms::calibrate，Bootstrap 1000 次，seed 20260913）、36 个月决策曲线分析（DCA）。鉴于多因素 Cox 中两个基因均未达传统显著阈值（GNG7 P = 0.072、NFIA P = 0.241），本研究将样本外预测能力检验（5×5 折重复交叉验证 C-index）预设为负结果判定的关键指标。</w:t>
       </w:r>
     </w:p>
     <w:p>
@@ -312,7 +312,7 @@
           <w:b/>
           <w:sz w:val="24"/>
         </w:rPr>
-        <w:t>2.5  GEO 外部梯度验证</w:t>
+        <w:t>2.5  GEO 病理类型梯度验证（非生存验证）</w:t>
       </w:r>
     </w:p>
     <w:p>
@@ -634,7 +634,7 @@
           <w:b w:val="0"/>
           <w:sz w:val="22"/>
         </w:rPr>
-        <w:t>基于 MR 阳性结果，将 55 个工具 SNP 映射至 60 个候选基因，在 TCGA-THY 队列（409 例，27 例复发/死亡事件）中构建探索性候选基因评分：riskScore = −0.0053257 × GNG7 − 0.0003788 × NFIA。按中位数分为高（204 例）、低（205 例）风险组。评分 C-index = 0.666（95% CI 0.559–0.774，concordance 正态近似；Bootstrap 1000 次内部验证乐观校正后 0.662）；两组无复发生存差异显著（Log-rank P = 0.041）；时间依赖 ROC（KM 法）1/3/5 年 AUC 分别为 0.657、0.612、0.593；3 年校准曲线（rms::calibrate，Bootstrap 1000 次，seed 20260913）平均绝对误差 0.037；决策曲线分析显示模型在 0.01、0.02 及 0.04–0.08 的低阈值范围内净获益为正。变量选择稳定性：Bootstrap 200 次中 GNG7 保留频率 151/200（75.5%）、NFIA 保留频率 113/200（56.5%）（均以负向系数进入，与评分方向一致）；5×5 折重复交叉验证 C-index 均值 0.334（范围 0.039-0.826）。补充重跑 Lasso-Cox（10 折交叉验证，seed = 20260913，缺失值中位数填补）与弹性网（α = 0.5）：Lasso 在 lambda.min 路径保留 43 个变量（含 GNG7、NFIA，系数均为负向，与评分方向一致），而 lambda.1se 路径与弹性网两条路径均将全部变量收缩为 0，提示正则化变量选择结果不稳定；多因素 Cox 中 GNG7（P = 0.072）与 NFIA（P = 0.241）亦未达传统显著性阈值，故本评分定位为探索性候选基因评分，而非验证性预后模型。上述区分度指标均源于训练队列，未经独立生存队列验证，尚不足以支持任何临床决策。</w:t>
+        <w:t>基于 MR 阳性结果，将 55 个工具 SNP 映射至 60 个候选基因，在 TCGA-THY 队列（409 例，27 例复发/死亡事件）中构建探索性候选基因评分：riskScore = −0.0053257 × GNG7 − 0.0003788 × NFIA。按中位数分为高（204 例）、低（205 例）风险组。评分 C-index = 0.666（95% CI 0.559–0.774，concordance 正态近似；Bootstrap 1000 次内部验证乐观校正后 0.662）；两组无复发生存差异显著（Log-rank P = 0.041）；时间依赖 ROC（KM 法）1/3/5 年 AUC 分别为 0.657、0.612、0.593；3 年校准曲线（rms::calibrate，Bootstrap 1000 次，seed 20260913）平均绝对误差 0.037；决策曲线分析显示模型在 0.01、0.02 及 0.04–0.08 的低阈值范围内净获益为正。变量选择稳定性：Bootstrap 200 次中 GNG7 保留频率 151/200（75.5%）、NFIA 保留频率 113/200（56.5%）（均以负向系数进入，与评分方向一致）；5×5 折重复交叉验证 C-index 均值 0.334（范围 0.039-0.826），低于随机水平 0.5，明确提示该评分无样本外预测能力（负结果）；内部 C-index 0.666 很可能源于过拟合，该评分不应视为预后模型。补充重跑 Lasso-Cox（10 折交叉验证，seed = 20260913，缺失值中位数填补）与弹性网（α = 0.5）：Lasso 在 lambda.min 路径保留 43 个变量（含 GNG7、NFIA，系数均为负向，与评分方向一致），而 lambda.1se 路径与弹性网两条路径均将全部变量收缩为 0，提示正则化变量选择结果不稳定；多因素 Cox 中 GNG7（P = 0.072）与 NFIA（P = 0.241）亦未达传统显著性阈值，故本评分定位为探索性候选基因评分，而非验证性预后模型。上述区分度指标均源于训练队列，未经独立生存队列验证，尚不足以支持任何临床决策。</w:t>
       </w:r>
     </w:p>
     <w:p>
@@ -1232,7 +1232,7 @@
           <w:b w:val="0"/>
           <w:sz w:val="22"/>
         </w:rPr>
-        <w:t>本研究以两样本孟德尔随机化为起点，评估了遗传预测的 TSH 水平与甲状腺癌风险的因果关联，并完成了"遗传工具 SNP—候选基因—预后评分—外部验证—生物学与临床转化"的完整分析链。主要发现包括：其一，遗传预测的 TSH 水平升高与甲状腺癌发病风险降低相关（IVW OR = 0.487，95% CI 0.335–0.709），该关联在 MR-PRESSO 校正估计、MR-RAPS及两个复制结局中方向一致，在校正 BMI 与睾酮后方向仍一致（MVMR OR = 0.525，95% CI 0.317–0.869，P = 0.0123，但受弱工具限制）；其二，由 GNG7 与 NFIA 构建的探索性候选基因评分在 TCGA-THY 队列中显示出初步的区分趋势（C-index = 0.666，Log-rank P = 0.041），并在 GEO 独立数据集中呈病理类型梯度，但未经独立生存队列验证；其三，高风险组免疫微环境呈炎症激活特征，且计算预测其对绝大多数药物（176 种显著药物中 158 种）耐药、仅对少数药物（如 Selumetinib、KU-55933）敏感，均为计算推断、假设生成性质。</w:t>
+        <w:t>本研究为 TSH-甲状腺癌因果关联的重复验证与扩展分析，以两样本孟德尔随机化为核心评估遗传预测 TSH 水平与甲状腺癌风险的因果关联，并在此基础上行探索性延伸。主要发现包括：其一，遗传预测的 TSH 水平升高与甲状腺癌发病风险降低相关（IVW OR = 0.487，95% CI 0.335–0.709），该关联在 MR-PRESSO 校正估计、MR-RAPS及两个复制结局中方向一致，在校正 BMI 与睾酮后方向仍一致（MVMR OR = 0.525，95% CI 0.317–0.869，P = 0.0123，但受弱工具限制）；其二，由 GNG7 与 NFIA 构建的候选基因评分在训练队列中 C-index = 0.666，但 5×5 折样本外 C-index 均值 0.334（低于随机水平 0.5），为负结果——该评分无样本外预测能力；GEO 独立数据集仅支持病理类型梯度（非生存验证）；其三，高风险组免疫微环境呈炎症激活特征，且计算预测其对绝大多数药物（176 种显著药物中 158 种）耐药、仅对少数药物（如 Selumetinib、KU-55933）敏感，均为计算推断、假设生成性质。</w:t>
       </w:r>
     </w:p>
     <w:p>
@@ -1314,7 +1314,7 @@
           <w:b/>
           <w:sz w:val="24"/>
         </w:rPr>
-        <w:t>4.3  预后基因的潜在意义</w:t>
+        <w:t>4.3  候选基因评分的负结果解读与机制假设</w:t>
       </w:r>
     </w:p>
     <w:p>
@@ -1436,7 +1436,7 @@
           <w:b w:val="0"/>
           <w:sz w:val="22"/>
         </w:rPr>
-        <w:t>本研究存在以下局限性：（1）候选基因评分尚未在任何独立队列完成生存终点验证——我们已系统检索公共 GEO 甲状腺癌队列（含 GSE60542、GSE29265），确认这些数据集均为组织表达数据、不含生存随访信息，故仅能进行病理类型梯度验证，这是评分转化价值的主要限制之一；（2）评分训练队列仅 27 例事件（EPV ≈ 13.5），过拟合风险较高，C-index 0.666 属中等区分能力，乐观校正后为 0.662，95% CI 下限 0.559 接近随机水平，5 年 AUC = 0.593 亦接近随机猜测，Bootstrap 变量选择保留频率有限（GNG7 151/200（75.5%）、NFIA 113/200（56.5%）），故评分仅显示初步区分趋势，仅定位为探索性分析；（3）MR 分析基于欧洲人群 GWAS，结论向其他人群外推需谨慎；主分析 Cochran Q 异质性（P = 1.99×10⁻²⁷，I² = 75.7%）与 MR-PRESSO 全局检验（P &lt; 1×10⁻⁴）均显著，提示工具变量间存在异质性/多效性，尽管失真检验（P = 0.119）、MR-Egger 截距（P = 0.906）与 MR-PRESSO 校正估计、MR-RAPS 均支持方向不变，该残余异质性仍构成 MR 结论的固有局限；（4）MVMR 中 BMI 与睾酮条件 F 统计量低于 10（弱工具）、条件异质性 Q 显著（P = 1.81×10⁻²⁷），BMI/睾酮效应估计不可靠，TSH 直接效应虽显著但其精确性受上述因素制约，故本研究不足以断言 TSH 效应独立于BMI 与性激素；（5）变量选择：Lasso-Cox 仅 lambda.min 路径保留 GNG7/NFIA 等 43 个变量，lambda.1se 与弹性网路径均为 0 变量，正则化选择结果不稳定、模型系数不确定性大；（6）药物敏感性为基于细胞系模型的计算预测、假设生成性质，未经体内外实验验证，训练集交叉验证 R² 中位数 0.350 提示拟合有限，且药物间 IC50 高度相关、独立 FDR 可能高估显著药物数量（虽置换检验显示组间差异显著超出随机期望）；（7）免疫浸润为转录组相对富集推断，未经蛋白水平验证，未用去卷积方法交叉验证，未校正肿瘤纯度、亚型与 BRAF/RAS 突变状态，高/低风险组基于同一数据定义存在数据驱动偏倚；（8）决策曲线分析显示评分仅在低阈值区间（0.01、0.02、0.04–0.08）净获益为正；（9）校准曲线在仅 27 例事件下表现良好，不能排除过拟合导致的校准乐观；（10）受限于回顾性 TCGA 数据，本评分未纳入 TSH 抑制治疗记录（TRIPOD+AI 条目 6c），治疗暴露对预后分层的影响无法评估；（11）MR 证据在不同工具变量集与结局定义下方向不完全一致（含一项已撤稿研究），该异质性本身值得进一步研究；（12）反向 MR因甲状腺癌结局 GWAS 缺乏全基因组显著的独立工具 SNP（主结局仅 1054 例病例）而未执行，共定位与 eQTL-MR 亦因缺乏匹配的甲状腺组织 eQTL 资源未执行，工具 SNP 与候选基因的功能关联仅停留在基因组定位层面；（13）未评估暴露与结局 GWAS 之间的样本重叠程度（主结局 UKB 相关数据集与 BMI/睾酮 UKB 数据存在潜在重叠），样本重叠可能引入偏倚；（14）未按甲状腺癌亚型（PTC、FTC、ATC、MTC）及性别分层分析，亚型与性别相关异质性可能未被捕获。</w:t>
+        <w:t>本研究存在以下局限性：（1）候选基因评分尚未在任何独立队列完成生存终点验证——我们已系统检索公共 GEO 甲状腺癌队列（含 GSE60542、GSE29265），确认这些数据集均为组织表达数据、不含生存随访信息，故仅能进行病理类型梯度验证，这是评分转化价值的主要限制之一；（2）评分训练队列仅 27 例事件（EPV ≈ 13.5），过拟合风险较高，C-index 0.666 属中等区分能力，乐观校正后为 0.662，95% CI 下限 0.559 接近随机水平，5 年 AUC = 0.593 亦接近随机猜测，Bootstrap 变量选择保留频率有限（GNG7 151/200（75.5%）、NFIA 113/200（56.5%）），故评分仅显示初步区分趋势，仅定位为探索性分析；（3）MR 分析基于欧洲人群 GWAS，结论向其他人群外推需谨慎；主分析 Cochran Q 异质性（P = 1.99×10⁻²⁷，I² = 75.7%）与 MR-PRESSO 全局检验（P &lt; 1×10⁻⁴）均显著，提示工具变量间存在异质性/多效性，尽管失真检验（P = 0.119）、MR-Egger 截距（P = 0.906）与 MR-PRESSO 校正估计、MR-RAPS 均支持方向不变，该残余异质性仍构成 MR 结论的固有局限；（4）MVMR 中 BMI 与睾酮条件 F 统计量低于 10（弱工具）、条件异质性 Q 显著（P = 1.81×10⁻²⁷），BMI/睾酮效应估计不可靠，TSH 直接效应虽显著但其精确性受上述因素制约，故本研究不足以断言 TSH 效应独立于BMI 与性激素；（5）变量选择：Lasso-Cox 仅 lambda.min 路径保留 GNG7/NFIA 等 43 个变量，lambda.1se 与弹性网路径均为 0 变量，正则化选择结果不稳定、模型系数不确定性大；（6）药物敏感性为基于细胞系模型的计算预测、假设生成性质，未经体内外实验验证，训练集交叉验证 R² 中位数 0.350 提示拟合有限，且药物间 IC50 高度相关、独立 FDR 可能高估显著药物数量（虽置换检验显示组间差异显著超出随机期望）；（7）免疫浸润为转录组相对富集推断，未经蛋白水平验证，未用去卷积方法交叉验证，未校正肿瘤纯度、亚型与 BRAF/RAS 突变状态，高/低风险组基于同一数据定义存在数据驱动偏倚；（8）决策曲线分析显示评分仅在低阈值区间（0.01、0.02、0.04–0.08）净获益为正；（9）校准曲线在仅 27 例事件下表现良好，不能排除过拟合导致的校准乐观；（10）受限于回顾性 TCGA 数据，本评分未纳入 TSH 抑制治疗记录（TRIPOD+AI 条目 6c），治疗暴露对预后分层的影响无法评估；（11）MR 证据在不同工具变量集与结局定义下方向不完全一致（含一项已撤稿研究），该异质性本身值得进一步研究；（12）反向 MR因甲状腺癌结局 GWAS 缺乏全基因组显著的独立工具 SNP（主结局仅 1054 例病例）而未执行；共定位（colocalization）需要暴露 GWAS 完整区域的汇总统计量，而 Zhou 等（2020）公开数据仅含筛选后的工具位点，无法进行标准共定位分析，eQTL-MR 亦未执行，故工具 SNP 与候选基因的功能关联仅停留在基因组定位层面；（13）未评估暴露与结局 GWAS 之间的样本重叠程度（主结局 UKB 相关数据集与 BMI/睾酮 UKB 数据存在潜在重叠），样本重叠可能引入偏倚；（14）未按甲状腺癌亚型（PTC、FTC、ATC、MTC）及性别分层分析，亚型与性别相关异质性可能未被捕获。</w:t>
       </w:r>
     </w:p>
     <w:p>
@@ -1463,7 +1463,7 @@
           <w:b w:val="0"/>
           <w:sz w:val="22"/>
         </w:rPr>
-        <w:t>本研究通过两样本孟德尔随机化提供了遗传预测的 TSH 水平升高与甲状腺癌风险降低相关的探索性证据（与既往文献一致，且经 PRESSO 校正与稳健方法复核），并构建了基于 GNG7 与 NFIA 的探索性候选基因评分，经外部数据病理类型梯度验证；评分区分度处于初步水平（C-index 0.666，95% CI 0.559–0.774），未经独立生存队列验证，尚不足以支持临床决策。计算预测提示高风险组具有免疫激活微环境及对绝大多数预测药物（176 种显著药物中 158 种）耐药的假设性特征。本研究属探索性、假设生成研究，评分的临床价值与生物学意义需要在更大样本、多中心、前瞻性队列及实验中验证后方可评估。</w:t>
+        <w:t>本研究作为 TSH-甲状腺癌因果关联的重复验证与扩展分析，再次支持遗传预测 TSH 升高与甲状腺癌发病风险降低相关（主分析 IVW OR = 0.487，PRESSO 校正 OR = 0.579，两个复制结局方向一致），但工具变量间异质性高（I² = 75.7%）、MVMR 受弱工具限制且共定位证据缺失，因果证据强度有限。候选基因评分经重复交叉验证显示样本外无预测能力（C-index 0.334，低于随机水平 0.5），为负结果，不应视为预后模型。免疫浸润与药物敏感性均为计算预测、假设生成性质。本研究属探索性、假设生成研究，其临床与生物学意义需独立生存队列、实验验证与机制学研究确认后方可评估。</w:t>
       </w:r>
     </w:p>
     <w:p>
@@ -1490,7 +1490,7 @@
           <w:b w:val="0"/>
           <w:sz w:val="22"/>
         </w:rPr>
-        <w:t>数据可用性声明：暴露 GWAS（Zhou 等，2020）与结局 GWAS（ebi-a-GCST90018929、ebi-a-GCST90013867、finn-b-C3_THYROID_GLAND）汇总统计量均来自 IEU OpenGWAS 数据库（https://gwas.mrcieu.ac.uk/）；TCGA-THY 表达与临床数据来自 TCGA/GDC 公共数据库；外部验证表达数据来自 NCBI GEO（GSE33630）；药物敏感性训练数据使用 GDSC2（805 细胞系 × 198 药物）。全部 13 个分析脚本（脚本 A–K 及脚本 L，含 MR 敏感性二轮补跑、MVMR 条件检验、Lasso/弹性网重跑、Bootstrap 稳定性、药敏交叉验证与置换检验）已整理为可复现脚本包，完整代码公开于 GitHub （https://github.com/qwe2412/TSH-ThyroidCancer-MR，共 6 次提交，含脚本、运行说明、论文构建与发布脚本）；Zenodo 版本 DOI 将于论文接收后经归档补充。工具 SNP 列表与全部敏感性分析输出见补充材料。</w:t>
+        <w:t>数据可用性声明：暴露 GWAS（Zhou 等，2020）与结局 GWAS（ebi-a-GCST90018929、ebi-a-GCST90013867、finn-b-C3_THYROID_GLAND）汇总统计量均来自 IEU OpenGWAS 数据库（https://gwas.mrcieu.ac.uk/）；TCGA-THY 表达与临床数据来自 TCGA/GDC 公共数据库；外部验证表达数据来自 NCBI GEO（GSE33630）；药物敏感性训练数据使用 GDSC2（805 细胞系 × 198 药物）。全部 13 个分析脚本（脚本 A–K 及脚本 L，含 MR 敏感性二轮补跑、MVMR 条件检验、Lasso/弹性网重跑、Bootstrap 稳定性、药敏交叉验证与置换检验）已整理为可复现脚本包，完整代码公开于 GitHub （https://github.com/qwe2412/TSH-ThyroidCancer-MR，共 9 次提交，含脚本、运行说明、论文构建与发布脚本）；Zenodo 版本 DOI 将于论文接收后经归档补充。工具 SNP 列表与全部敏感性分析输出见补充材料。</w:t>
       </w:r>
     </w:p>
     <w:p>

</xml_diff>

<commit_message>
round-5: PRESSO corrected as parallel primary analysis, MVMR weakened (no 'significant'), prognostic/immune/drug sections compressed with negative-result focus, fig 1-6 renumbered, supp4 internal metrics, checklists updated, commit count 11
</commit_message>
<xml_diff>
--- a/副课题1论文_完整版_20260914.docx
+++ b/副课题1论文_完整版_20260914.docx
@@ -96,7 +96,7 @@
           <w:b w:val="0"/>
           <w:sz w:val="22"/>
         </w:rPr>
-        <w:t>【结果】两样本 MR 显示遗传预测 TSH 升高与甲状腺癌风险降低存在因果关联（主分析 IVW 随机效应 OR = 0.487，95% CI 0.335–0.709，P = 1.7×10⁻⁴，69 个有效 SNP），MR-Egger 截距检验未发现显著定向多效性（P = 0.906）；Cochran Q 检验提示工具变量间存在显著异质性（IVW Q = 279.39，df = 68，P = 1.99×10⁻²⁷，I² = 75.7%），MR-PRESSO 全局检验亦显著（P &lt; 1×10⁻⁴）并识别 4 个潜在离群 SNP；剔除离群 SNP 后随机效应 IVW 估计为 OR = 0.579（95% CI 0.452–0.741，65 个 SNP），方向与主分析一致；MR-RAPS 估计方向亦一致（OR = 0.476，P = 4.2×10⁻¹⁵）。两个复制结局方向一致（OR = 0.362，P = 6.10×10⁻⁶；OR = 0.559，P = 0.0025）。MVMR 在校正 BMI 与睾酮后 TSH 直接效应仍显著（54 SNP，OR = 0.525，95% CI 0.317–0.869，P = 0.0123，t 检验），但 BMI（条件 F = 5.66）与睾酮（条件 F = 3.38）为弱工具，该校正结果仅具探索性。由 GNG7 与 NFIA 构建的候选基因评分 C-index = 0.666（95% CI 0.559–0.774），高、低风险组生存差异显著（Log-rank P = 0.041）；Bootstrap 200 次变量选择中 GNG7 保留频率 151/200（75.5%）、NFIA 保留频率 113/200（56.5%），5×5 折重复交叉验证 C-index 均值 0.334（低于随机水平 0.5，样本外无预测能力）；GSE33630 中评分呈 ATC &gt; PTC &gt; Normal 病理类型梯度（Kruskal-Wallis P = 1.75×10⁻¹²，非生存验证）。28 种免疫细胞的相对富集评分中 25 种组间差异显著（FDR &lt; 0.05），高风险组呈免疫激活伴耗竭特征；计算预测提示 176 种药物（88.9%）的 IC50 组间差异显著，其中高风险组对 158 种更耐药、仅 18 种更敏感；代表药物 5 折交叉验证 R² 中位数 0.350，组标签置换（500 次）显示显著药物数（176）远高于随机期望（置换中位数 0.62，P &lt; 0.002）。</w:t>
+        <w:t>【结果】两样本 MR 显示遗传预测 TSH 升高与甲状腺癌风险降低存在因果关联（主分析 IVW 随机效应 OR = 0.487，95% CI 0.335–0.709，P = 1.7×10⁻⁴，69 个有效 SNP），MR-Egger 截距检验未发现显著定向多效性（P = 0.906）；Cochran Q 检验提示工具变量间存在显著异质性（IVW Q = 279.39，df = 68，P = 1.99×10⁻²⁷，I² = 75.7%），MR-PRESSO 全局检验亦显著（P &lt; 1×10⁻⁴）并识别 4 个潜在离群 SNP；鉴于异质性与离群检验均显著，将 MR-PRESSO 离群校正估计与 IVW 并列为主分析：剔除 4 个离群 SNP 后（65 个 SNP）随机效应 IVW 估计 OR = 0.579（95% CI 0.452–0.741，P = 1.44×10⁻⁵），与未校正 IVW 方向一致、效应量略向零收缩；MR-RAPS 估计方向亦一致（OR = 0.476，P = 4.2×10⁻¹⁵）。两个复制结局方向一致（OR = 0.362，P = 6.10×10⁻⁶；OR = 0.559，P = 0.0025）。MVMR 在校正 BMI 与睾酮后 TSH 效应方向仍一致（54 SNP，OR = 0.525，95% CI 0.317–0.869，P = 0.0123），但 BMI 与睾酮为弱工具（条件 F 分别为 5.66、3.38）且条件异质性显著，TSH 独立效应无法确认，该结果仅具探索性。由 GNG7 与 NFIA 构建的候选基因评分 C-index = 0.666（95% CI 0.559–0.774），高、低风险组生存差异显著（Log-rank P = 0.041）；Bootstrap 200 次变量选择中 GNG7 保留频率 151/200（75.5%）、NFIA 保留频率 113/200（56.5%），5×5 折重复交叉验证 C-index 均值 0.334（低于随机水平 0.5，样本外无预测能力）；GSE33630 中评分呈 ATC &gt; PTC &gt; Normal 病理类型梯度（Kruskal-Wallis P = 1.75×10⁻¹²，非生存验证）。28 种免疫细胞的相对富集评分中 25 种组间差异显著（FDR &lt; 0.05），高风险组呈免疫激活伴耗竭特征；计算预测提示 176 种药物（88.9%）的 IC50 组间差异显著，其中高风险组对 158 种更耐药、仅 18 种更敏感；代表药物 5 折交叉验证 R² 中位数 0.350，组标签置换（500 次）显示显著药物数（176）远高于随机期望（置换中位数 0.62，P &lt; 0.002）。</w:t>
       </w:r>
     </w:p>
     <w:p>
@@ -380,7 +380,7 @@
           <w:b w:val="0"/>
           <w:sz w:val="22"/>
         </w:rPr>
-        <w:t>以 GDSC2 表达矩阵（17419 基因 × 805 细胞系）与 IC50 矩阵（805 细胞系 × 198 药物，log 尺度经 exp 转回）为训练集，以 oncoPredict::calcPhenotype（batchCorrect = "standardize"，powerTransformPhenotype = TRUE，removeLowVaryingGenes = 0.2，minNumSamples = 10，seed 经 set.seed(123) 设定）计算预测 TCGA-THY 409 例患者对 198 种药物的 IC50；以 Wilcoxon 秩和检验比较组间差异并作 FDR 校正。为评估预测可靠性：（1）对 12 个代表性药物在 GDSC2 训练集行 5 折交叉验证（ridge 回归，log IC50 尺度，报告 R² 与 RMSE）；（2）行组标签置换检验（B = 500 次）估计 FDR &lt; 0.05 显著药物数的零分布，与实际显著药物数比较。</w:t>
+        <w:t>以 GDSC2 表达矩阵（17419 基因 × 805 细胞系）与 IC50 矩阵（805 细胞系 × 198 药物，log 尺度经 exp 转回）为训练集，以 oncoPredict::calcPhenotype（batchCorrect = "standardize"，powerTransformPhenotype = TRUE，removeLowVaryingGenes = 0.2，minNumSamples = 10，seed 经 set.seed(123) 设定）计算预测 TCGA-THY 409 例患者对 198 种药物的 IC50；以 Wilcoxon 秩和检验比较组间差异并作 FDR 校正。为评估预测可靠性：（1）对 12 个代表性药物（5-Fluorouracil、Paclitaxel、Docetaxel、Cisplatin、Camptothecin、Vinblastine、Sorafenib、Nilotinib、GSK591、VE821、Daporinad、Selumetinib，覆盖细胞毒化疗与靶向/表观遗传类作用机制）在 GDSC2 训练集行 5 折交叉验证（ridge 回归，log IC50 尺度，报告 R² 与 RMSE）；（2）行组标签置换检验（B = 500 次）估计 FDR &lt; 0.05 显著药物数的零分布，与实际显著药物数比较。</w:t>
       </w:r>
     </w:p>
     <w:p>
@@ -474,7 +474,7 @@
           <w:b w:val="0"/>
           <w:sz w:val="22"/>
         </w:rPr>
-        <w:t>两样本 MR 主分析（69 个有效 SNP）中，IVW 随机效应模型显示遗传预测 TSH 升高与甲状腺癌风险降低相关（b = −0.719，SE = 0.192，OR = 0.487，95% CI 0.335–0.709，P = 1.73×10⁻⁴）；MR-Egger（OR = 0.467，P = 0.062）、加权中位数（OR = 0.626，P = 0.0032）、简单众数（OR = 0.405，P = 0.012）方向一致，加权众数（OR = 0.702，P = 0.091）方向一致但未达显著。按 MR-PRESSO 失真检验识别的 4 个离群 SNP 剔除后，随机效应 IVW 估计方向与主分析一致（65 个 SNP，OR = 0.579，95% CI 0.452–0.741，P = 1.4×10⁻⁵），提示离群 SNP 未驱动主结论。MR-RAPS（对系统与特异多效性稳健）估计方向亦一致（OR = 0.476，P = 4.2×10⁻¹⁵）；Steiger 方向性检验 支持暴露→结局方向（correct_causal_direction = TRUE，Steiger P = 0）。该关联在两个复制结局中重现：ebi-a-GCST90013867（SPA 校正甲状腺癌 GWAS，65 个有效 SNP）IVW OR = 0.362，95% CI 0.233–0.562，P = 6.10×10⁻⁶，异质性 Q = 164.89（I² = 61.2%），MR-Egger 截距 P = 0.869，MR-PRESSO 全局检验 P = &lt;5×10⁻⁴；finn-b-C3_THYROID_GLAND（FinnGen，68 个有效 SNP）IVW OR = 0.559，95% CI 0.384–0.816，P = 0.0025，异质性 Q = 195.53（I² = 65.7%），MR-Egger 截距 P = 0.411，MR-PRESSO 全局检验 P = &lt;5×10⁻⁴。两个复制结局效应量差异（OR 0.362 vs 0.559）可能与结局的病例构成（FinnGen 以芬兰人群为主、病例数较少）及统计功效不同有关，但方向一致。</w:t>
+        <w:t>两样本 MR 主分析（69 个有效 SNP）中，IVW 随机效应模型显示遗传预测 TSH 升高与甲状腺癌风险降低相关（b = −0.719，SE = 0.192，OR = 0.487，95% CI 0.335–0.709，P = 1.73×10⁻⁴）；MR-Egger（OR = 0.467，P = 0.062）、加权中位数（OR = 0.626，P = 0.0032）、简单众数（OR = 0.405，P = 0.012）方向一致，加权众数（OR = 0.702，P = 0.091）方向一致但未达显著。鉴于 Cochran Q 与 MR-PRESSO 全局检验均提示显著异质性/离群，本研究将 MR-PRESSO 离群校正估计与 IVW 并列作为主分析：按 MR-PRESSO 离群检验识别的 4 个离群 SNP（rs10186921、rs116909374、rs2993047、rs925488；失真检验显示剔除前后因果估计无显著变化，失真系数 −31.5%，P = 0.119）剔除后，随机效应 IVW 估计（65 个 SNP）OR = 0.579，95% CI 0.452–0.741，P = 1.44×10⁻⁵，与未校正 IVW 方向一致、效应量略向零收缩，提示离群 SNP 未驱动主结论。MR-RAPS（对系统与特异多效性稳健）估计方向亦一致（OR = 0.476，P = 4.2×10⁻¹⁵）；Steiger 方向性检验 支持暴露→结局方向（correct_causal_direction = TRUE，Steiger P = 0）。该关联在两个复制结局中重现：ebi-a-GCST90013867（SPA 校正甲状腺癌 GWAS，65 个有效 SNP）IVW OR = 0.362，95% CI 0.233–0.562，P = 6.10×10⁻⁶，异质性 Q = 164.89（I² = 61.2%），MR-Egger 截距 P = 0.869，MR-PRESSO 全局检验 P = &lt;5×10⁻⁴；finn-b-C3_THYROID_GLAND（FinnGen，68 个有效 SNP）IVW OR = 0.559，95% CI 0.384–0.816，P = 0.0025，异质性 Q = 195.53（I² = 65.7%），MR-Egger 截距 P = 0.411，MR-PRESSO 全局检验 P = &lt;5×10⁻⁴。两个复制结局效应量差异（OR 0.362 vs 0.559）可能与结局的病例构成（FinnGen 以芬兰人群为主、病例数较少）及统计功效不同有关，但方向一致。</w:t>
       </w:r>
     </w:p>
     <w:p>
@@ -585,6 +585,112 @@
     </w:p>
     <w:p>
       <w:pPr>
+        <w:jc w:val="center"/>
+      </w:pPr>
+      <w:r>
+        <w:drawing>
+          <wp:inline xmlns:a="http://schemas.openxmlformats.org/drawingml/2006/main" xmlns:pic="http://schemas.openxmlformats.org/drawingml/2006/picture">
+            <wp:extent cx="4680000" cy="3120000"/>
+            <wp:docPr id="3" name="Picture 3"/>
+            <wp:cNvGraphicFramePr>
+              <a:graphicFrameLocks noChangeAspect="1"/>
+            </wp:cNvGraphicFramePr>
+            <a:graphic>
+              <a:graphicData uri="http://schemas.openxmlformats.org/drawingml/2006/picture">
+                <pic:pic>
+                  <pic:nvPicPr>
+                    <pic:cNvPr id="0" name="fig13_mr_funnel.png"/>
+                    <pic:cNvPicPr/>
+                  </pic:nvPicPr>
+                  <pic:blipFill>
+                    <a:blip r:embed="rId11"/>
+                    <a:stretch>
+                      <a:fillRect/>
+                    </a:stretch>
+                  </pic:blipFill>
+                  <pic:spPr>
+                    <a:xfrm>
+                      <a:off x="0" y="0"/>
+                      <a:ext cx="4680000" cy="3120000"/>
+                    </a:xfrm>
+                    <a:prstGeom prst="rect"/>
+                  </pic:spPr>
+                </pic:pic>
+              </a:graphicData>
+            </a:graphic>
+          </wp:inline>
+        </w:drawing>
+      </w:r>
+    </w:p>
+    <w:p>
+      <w:pPr>
+        <w:spacing w:after="200"/>
+        <w:jc w:val="center"/>
+      </w:pPr>
+      <w:r>
+        <w:rPr>
+          <w:rFonts w:ascii="Times New Roman" w:hAnsi="Times New Roman" w:eastAsia="宋体"/>
+          <w:b w:val="0"/>
+          <w:sz w:val="18"/>
+        </w:rPr>
+        <w:t>图 3  两样本 MR 漏斗图（IVW 与 MR-Egger 估计）</w:t>
+      </w:r>
+    </w:p>
+    <w:p>
+      <w:pPr>
+        <w:jc w:val="center"/>
+      </w:pPr>
+      <w:r>
+        <w:drawing>
+          <wp:inline xmlns:a="http://schemas.openxmlformats.org/drawingml/2006/main" xmlns:pic="http://schemas.openxmlformats.org/drawingml/2006/picture">
+            <wp:extent cx="4680000" cy="6240000"/>
+            <wp:docPr id="4" name="Picture 4"/>
+            <wp:cNvGraphicFramePr>
+              <a:graphicFrameLocks noChangeAspect="1"/>
+            </wp:cNvGraphicFramePr>
+            <a:graphic>
+              <a:graphicData uri="http://schemas.openxmlformats.org/drawingml/2006/picture">
+                <pic:pic>
+                  <pic:nvPicPr>
+                    <pic:cNvPr id="0" name="fig14_mr_leaveoneout.png"/>
+                    <pic:cNvPicPr/>
+                  </pic:nvPicPr>
+                  <pic:blipFill>
+                    <a:blip r:embed="rId12"/>
+                    <a:stretch>
+                      <a:fillRect/>
+                    </a:stretch>
+                  </pic:blipFill>
+                  <pic:spPr>
+                    <a:xfrm>
+                      <a:off x="0" y="0"/>
+                      <a:ext cx="4680000" cy="6240000"/>
+                    </a:xfrm>
+                    <a:prstGeom prst="rect"/>
+                  </pic:spPr>
+                </pic:pic>
+              </a:graphicData>
+            </a:graphic>
+          </wp:inline>
+        </w:drawing>
+      </w:r>
+    </w:p>
+    <w:p>
+      <w:pPr>
+        <w:spacing w:after="200"/>
+        <w:jc w:val="center"/>
+      </w:pPr>
+      <w:r>
+        <w:rPr>
+          <w:rFonts w:ascii="Times New Roman" w:hAnsi="Times New Roman" w:eastAsia="宋体"/>
+          <w:b w:val="0"/>
+          <w:sz w:val="18"/>
+        </w:rPr>
+        <w:t>图 4  留一法敏感性分析图（剔除单个 SNP 后的 IVW 估计）</w:t>
+      </w:r>
+    </w:p>
+    <w:p>
+      <w:pPr>
         <w:spacing w:before="200" w:after="120"/>
       </w:pPr>
       <w:r>
@@ -607,7 +713,7 @@
           <w:b w:val="0"/>
           <w:sz w:val="22"/>
         </w:rPr>
-        <w:t>以 TSH 70 个工具 SNP 为骨架、校正 BMI（ieu-b-40）与总睾酮（ebi-a-GCST90014013）后，三暴露 MVMR-IVW（54 个三暴露与结局均有效的 SNP）显示 TSH 对甲状腺癌的独立保护效应仍显著（b = −0.645，SE = 0.258，OR = 0.525，95% CI 0.317–0.869，P = 0.0123，t 检验），BMI（b = −0.525，SE = 2.945，OR = 0.591，P = 0.859）与睾酮（b = 2.394，SE = 4.699，OR = 10.96，P = 0.613）均无独立显著效应。条件 F 统计量显示 TSH 工具强度合格（条件 F = 32.74），而 BMI（条件 F = 5.66）与睾酮（条件 F = 3.38）条件工具强度不足（F &lt; 10，弱工具），提示二者效应估计不可靠；MVMR 异质性 Q 统计量显著（Q = 244.76，df = 50，P = 1.81×10⁻²⁷），提示工具有效性假设可能部分不成立；以 Q 统计量最小化方法（qhet_mvmr，1000 次）估计：TSH b = −0.628（BMI b = -0.7455、睾酮 b = 6.3992）。综上，TSH 直接效应在校正 BMI 与睾酮后方向仍一致，但 BMI/睾酮弱工具与条件异质性使该校正分析仅具探索性，不足以断言 TSH 效应独立于 BMI 与性激素水平。</w:t>
+        <w:t>以 TSH 70 个工具 SNP 为骨架、校正 BMI（ieu-b-40）与总睾酮（ebi-a-GCST90014013）后，三暴露 MVMR-IVW（54 个三暴露与结局均有效的 SNP）显示校正 BMI 与总睾酮后TSH 对甲状腺癌的效应方向仍一致（b = −0.645，SE = 0.258，OR = 0.525，95% CI 0.317–0.869，P = 0.0123，t 检验），BMI（b = −0.525，SE = 2.945，OR = 0.591，P = 0.859）与睾酮（b = 2.394，SE = 4.699，OR = 10.96，P = 0.613）均未显示独立效应。条件 F 统计量显示 TSH 工具强度合格（条件 F = 32.74），而 BMI（条件 F = 5.66）与睾酮（条件 F = 3.38）条件工具强度不足（F &lt; 10，弱工具），提示二者效应估计不可靠；MVMR 异质性 Q 统计量显著（Q = 244.76，df = 50，P = 1.81×10⁻²⁷），提示工具有效性假设可能部分不成立；以 Q 统计量最小化方法（qhet_mvmr，Bootstrap 1000 次，CI = TRUE）估计：TSH b = −0.628（95% CI −1.203 至 −0.193），BMI b = −0.746、睾酮 b = 6.399（qhet_mvmr 为区间最小化启发式估计，其 Bootstrap 仅输出点估计与 CI，不输出 SE/P）。综上，TSH 效应在校正 BMI 与睾酮后方向仍一致，但 BMI/睾酮弱工具与条件异质性使该校正分析仅具探索性，不足以断言 TSH 效应独立于 BMI 与性激素水平。</w:t>
       </w:r>
     </w:p>
     <w:p>
@@ -634,7 +740,7 @@
           <w:b w:val="0"/>
           <w:sz w:val="22"/>
         </w:rPr>
-        <w:t>基于 MR 阳性结果，将 55 个工具 SNP 映射至 60 个候选基因，在 TCGA-THY 队列（409 例，27 例复发/死亡事件）中构建探索性候选基因评分：riskScore = −0.0053257 × GNG7 − 0.0003788 × NFIA。按中位数分为高（204 例）、低（205 例）风险组。评分 C-index = 0.666（95% CI 0.559–0.774，concordance 正态近似；Bootstrap 1000 次内部验证乐观校正后 0.662）；两组无复发生存差异显著（Log-rank P = 0.041）；时间依赖 ROC（KM 法）1/3/5 年 AUC 分别为 0.657、0.612、0.593；3 年校准曲线（rms::calibrate，Bootstrap 1000 次，seed 20260913）平均绝对误差 0.037；决策曲线分析显示模型在 0.01、0.02 及 0.04–0.08 的低阈值范围内净获益为正。变量选择稳定性：Bootstrap 200 次中 GNG7 保留频率 151/200（75.5%）、NFIA 保留频率 113/200（56.5%）（均以负向系数进入，与评分方向一致）；5×5 折重复交叉验证 C-index 均值 0.334（范围 0.039-0.826），低于随机水平 0.5，明确提示该评分无样本外预测能力（负结果）；内部 C-index 0.666 很可能源于过拟合，该评分不应视为预后模型。补充重跑 Lasso-Cox（10 折交叉验证，seed = 20260913，缺失值中位数填补）与弹性网（α = 0.5）：Lasso 在 lambda.min 路径保留 43 个变量（含 GNG7、NFIA，系数均为负向，与评分方向一致），而 lambda.1se 路径与弹性网两条路径均将全部变量收缩为 0，提示正则化变量选择结果不稳定；多因素 Cox 中 GNG7（P = 0.072）与 NFIA（P = 0.241）亦未达传统显著性阈值，故本评分定位为探索性候选基因评分，而非验证性预后模型。上述区分度指标均源于训练队列，未经独立生存队列验证，尚不足以支持任何临床决策。</w:t>
+        <w:t>基于 MR 阳性结果，将 55 个工具 SNP 映射至 60 个候选基因，在 TCGA-THY 队列（409 例，27 例复发/死亡事件）中构建探索性候选基因评分：riskScore = −0.0053257 × GNG7 − 0.0003788 × NFIA。按中位数分为高（204 例）、低（205 例）风险组。评分 C-index = 0.666（95% CI 0.559–0.774，concordance 正态近似；Bootstrap 1000 次内部验证乐观校正后 0.662）；两组无复发生存差异显著（Log-rank P = 0.041）；时间依赖 ROC（KM 法）1/3/5 年 AUC 分别为 0.657、0.612、0.593；内部区分度指标（时间依赖 ROC 1/3/5 年 AUC = 0.657/0.612/0.593、3 年校准 MAE = 0.037、DCA 正净获益阈值 0.01/0.02/0.04–0.08）均源于训练队列、未经外部生存验证，完整图表见补充材料 4（补充图 1–3）。变量选择稳定性：Bootstrap 200 次中 GNG7 保留频率 151/200（75.5%）、NFIA 保留频率 113/200（56.5%）（均以负向系数进入，与评分方向一致）；5×5 折重复交叉验证 C-index 均值 0.334（范围 0.039-0.826），低于随机水平 0.5，明确提示该评分无样本外预测能力（负结果）；内部 C-index 0.666 很可能源于过拟合，该评分不应视为预后模型。补充重跑 Lasso-Cox（10 折交叉验证，seed = 20260913，缺失值中位数填补）与弹性网（α = 0.5）：Lasso 在 lambda.min 路径保留 43 个变量（含 GNG7、NFIA，系数均为负向，与评分方向一致），而 lambda.1se 路径与弹性网两条路径均将全部变量收缩为 0，提示正则化变量选择结果不稳定；多因素 Cox 中 GNG7（P = 0.072）与 NFIA（P = 0.241）亦未达传统显著性阈值，故本评分定位为探索性候选基因评分，而非验证性预后模型。上述区分度指标均源于训练队列，未经独立生存队列验证，尚不足以支持任何临床决策。</w:t>
       </w:r>
     </w:p>
     <w:p>
@@ -645,7 +751,7 @@
         <w:drawing>
           <wp:inline xmlns:a="http://schemas.openxmlformats.org/drawingml/2006/main" xmlns:pic="http://schemas.openxmlformats.org/drawingml/2006/picture">
             <wp:extent cx="4680000" cy="3510000"/>
-            <wp:docPr id="3" name="Picture 3"/>
+            <wp:docPr id="5" name="Picture 5"/>
             <wp:cNvGraphicFramePr>
               <a:graphicFrameLocks noChangeAspect="1"/>
             </wp:cNvGraphicFramePr>
@@ -657,7 +763,7 @@
                     <pic:cNvPicPr/>
                   </pic:nvPicPr>
                   <pic:blipFill>
-                    <a:blip r:embed="rId11"/>
+                    <a:blip r:embed="rId13"/>
                     <a:stretch>
                       <a:fillRect/>
                     </a:stretch>
@@ -687,113 +793,34 @@
           <w:b w:val="0"/>
           <w:sz w:val="18"/>
         </w:rPr>
-        <w:t>图 3  高、低风险组无复发生存 Kaplan-Meier 曲线（Log-rank P = 0.0412）</w:t>
+        <w:t>图 5  高、低风险组无复发生存 Kaplan-Meier 曲线（Log-rank P = 0.0412）</w:t>
       </w:r>
     </w:p>
     <w:p>
       <w:pPr>
-        <w:jc w:val="center"/>
+        <w:spacing w:before="200" w:after="120"/>
       </w:pPr>
       <w:r>
-        <w:drawing>
-          <wp:inline xmlns:a="http://schemas.openxmlformats.org/drawingml/2006/main" xmlns:pic="http://schemas.openxmlformats.org/drawingml/2006/picture">
-            <wp:extent cx="4680000" cy="3510000"/>
-            <wp:docPr id="4" name="Picture 4"/>
-            <wp:cNvGraphicFramePr>
-              <a:graphicFrameLocks noChangeAspect="1"/>
-            </wp:cNvGraphicFramePr>
-            <a:graphic>
-              <a:graphicData uri="http://schemas.openxmlformats.org/drawingml/2006/picture">
-                <pic:pic>
-                  <pic:nvPicPr>
-                    <pic:cNvPr id="0" name="fig3_roc.png"/>
-                    <pic:cNvPicPr/>
-                  </pic:nvPicPr>
-                  <pic:blipFill>
-                    <a:blip r:embed="rId12"/>
-                    <a:stretch>
-                      <a:fillRect/>
-                    </a:stretch>
-                  </pic:blipFill>
-                  <pic:spPr>
-                    <a:xfrm>
-                      <a:off x="0" y="0"/>
-                      <a:ext cx="4680000" cy="3510000"/>
-                    </a:xfrm>
-                    <a:prstGeom prst="rect"/>
-                  </pic:spPr>
-                </pic:pic>
-              </a:graphicData>
-            </a:graphic>
-          </wp:inline>
-        </w:drawing>
+        <w:rPr>
+          <w:rFonts w:ascii="Times New Roman" w:hAnsi="Times New Roman" w:eastAsia="黑体"/>
+          <w:b/>
+          <w:sz w:val="24"/>
+        </w:rPr>
+        <w:t>3.5  GEO 病理类型梯度验证</w:t>
       </w:r>
     </w:p>
     <w:p>
       <w:pPr>
-        <w:spacing w:after="200"/>
-        <w:jc w:val="center"/>
+        <w:spacing w:after="120"/>
+        <w:ind w:firstLine="440"/>
       </w:pPr>
       <w:r>
         <w:rPr>
           <w:rFonts w:ascii="Times New Roman" w:hAnsi="Times New Roman" w:eastAsia="宋体"/>
           <w:b w:val="0"/>
-          <w:sz w:val="18"/>
+          <w:sz w:val="22"/>
         </w:rPr>
-        <w:t>图 4  时间依赖 ROC 曲线（1/3/5 年 AUC = 0.657/0.612/0.593，KM 法）</w:t>
-      </w:r>
-    </w:p>
-    <w:p>
-      <w:pPr>
-        <w:jc w:val="center"/>
-      </w:pPr>
-      <w:r>
-        <w:drawing>
-          <wp:inline xmlns:a="http://schemas.openxmlformats.org/drawingml/2006/main" xmlns:pic="http://schemas.openxmlformats.org/drawingml/2006/picture">
-            <wp:extent cx="4680000" cy="3744000"/>
-            <wp:docPr id="5" name="Picture 5"/>
-            <wp:cNvGraphicFramePr>
-              <a:graphicFrameLocks noChangeAspect="1"/>
-            </wp:cNvGraphicFramePr>
-            <a:graphic>
-              <a:graphicData uri="http://schemas.openxmlformats.org/drawingml/2006/picture">
-                <pic:pic>
-                  <pic:nvPicPr>
-                    <pic:cNvPr id="0" name="fig4_calibration.png"/>
-                    <pic:cNvPicPr/>
-                  </pic:nvPicPr>
-                  <pic:blipFill>
-                    <a:blip r:embed="rId13"/>
-                    <a:stretch>
-                      <a:fillRect/>
-                    </a:stretch>
-                  </pic:blipFill>
-                  <pic:spPr>
-                    <a:xfrm>
-                      <a:off x="0" y="0"/>
-                      <a:ext cx="4680000" cy="3744000"/>
-                    </a:xfrm>
-                    <a:prstGeom prst="rect"/>
-                  </pic:spPr>
-                </pic:pic>
-              </a:graphicData>
-            </a:graphic>
-          </wp:inline>
-        </w:drawing>
-      </w:r>
-    </w:p>
-    <w:p>
-      <w:pPr>
-        <w:spacing w:after="200"/>
-        <w:jc w:val="center"/>
-      </w:pPr>
-      <w:r>
-        <w:rPr>
-          <w:rFonts w:ascii="Times New Roman" w:hAnsi="Times New Roman" w:eastAsia="宋体"/>
-          <w:b w:val="0"/>
-          <w:sz w:val="18"/>
-        </w:rPr>
-        <w:t>图 5  3 年校准曲线（rms::calibrate，Bootstrap 1000 次，MAE = 0.037）</w:t>
+        <w:t>在独立 GEO 数据集 GSE33630（105 例：11 例未分化型甲状腺癌 ATC、49 例乳头状型甲状腺癌 PTC、45 例正常甲状腺组织）中验证评分梯度。Kruskal-Wallis 检验显示三组间评分差异极显著（χ² = 54.147，df = 2，P = 1.75×10⁻¹²）；两两比较均达显著（ATC vs PTC，P = 7.0×10⁻¹¹；ATC vs Normal，P = 1.3×10⁻¹¹；PTC vs Normal，P = 3.2×10⁻⁹），评分呈 ATC &gt; PTC &gt; Normal 梯度。效应量均呈大效应（ATC vs PTC Cohen's d = 3.87，95% CI 2.91–4.83；ATC vs Normal d = 4.37，95% CI 3.32–5.43；PTC vs Normal d = 1.16，95% CI 0.72–1.60）。需说明：GSE33630 不含生存随访信息，本部分仅支持评分的病理学梯度意义，不构成生存终点的外部验证。</w:t>
       </w:r>
     </w:p>
     <w:p>
@@ -812,7 +839,7 @@
               <a:graphicData uri="http://schemas.openxmlformats.org/drawingml/2006/picture">
                 <pic:pic>
                   <pic:nvPicPr>
-                    <pic:cNvPr id="0" name="fig5_dca.png"/>
+                    <pic:cNvPr id="0" name="fig6_geo.png"/>
                     <pic:cNvPicPr/>
                   </pic:nvPicPr>
                   <pic:blipFill>
@@ -846,7 +873,7 @@
           <w:b w:val="0"/>
           <w:sz w:val="18"/>
         </w:rPr>
-        <w:t>图 6  36 个月决策曲线分析</w:t>
+        <w:t>图 6  GSE33630 中风险评分病理类型梯度（Kruskal-Wallis P = 1.75e-12）</w:t>
       </w:r>
     </w:p>
     <w:p>
@@ -859,7 +886,7 @@
           <w:b/>
           <w:sz w:val="24"/>
         </w:rPr>
-        <w:t>3.5  GEO 病理类型梯度验证</w:t>
+        <w:t>3.6  免疫浸润分析（计算推断，详见补充材料 4）</w:t>
       </w:r>
     </w:p>
     <w:p>
@@ -873,60 +900,7 @@
           <w:b w:val="0"/>
           <w:sz w:val="22"/>
         </w:rPr>
-        <w:t>在独立 GEO 数据集 GSE33630（105 例：11 例未分化型甲状腺癌 ATC、49 例乳头状型甲状腺癌 PTC、45 例正常甲状腺组织）中验证评分梯度。Kruskal-Wallis 检验显示三组间评分差异极显著（χ² = 54.147，df = 2，P = 1.75×10⁻¹²）；两两比较均达显著（ATC vs PTC，P = 7.0×10⁻¹¹；ATC vs Normal，P = 1.3×10⁻¹¹；PTC vs Normal，P = 3.2×10⁻⁹），评分呈 ATC &gt; PTC &gt; Normal 梯度。效应量均呈大效应（ATC vs PTC Cohen's d = 3.87，95% CI 2.91–4.83；ATC vs Normal d = 4.37，95% CI 3.32–5.43；PTC vs Normal d = 1.16，95% CI 0.72–1.60）。需说明：GSE33630 不含生存随访信息，本部分仅支持评分的病理学梯度意义，不构成生存终点的外部验证。</w:t>
-      </w:r>
-    </w:p>
-    <w:p>
-      <w:pPr>
-        <w:jc w:val="center"/>
-      </w:pPr>
-      <w:r>
-        <w:drawing>
-          <wp:inline xmlns:a="http://schemas.openxmlformats.org/drawingml/2006/main" xmlns:pic="http://schemas.openxmlformats.org/drawingml/2006/picture">
-            <wp:extent cx="4680000" cy="3510000"/>
-            <wp:docPr id="7" name="Picture 7"/>
-            <wp:cNvGraphicFramePr>
-              <a:graphicFrameLocks noChangeAspect="1"/>
-            </wp:cNvGraphicFramePr>
-            <a:graphic>
-              <a:graphicData uri="http://schemas.openxmlformats.org/drawingml/2006/picture">
-                <pic:pic>
-                  <pic:nvPicPr>
-                    <pic:cNvPr id="0" name="fig6_geo.png"/>
-                    <pic:cNvPicPr/>
-                  </pic:nvPicPr>
-                  <pic:blipFill>
-                    <a:blip r:embed="rId15"/>
-                    <a:stretch>
-                      <a:fillRect/>
-                    </a:stretch>
-                  </pic:blipFill>
-                  <pic:spPr>
-                    <a:xfrm>
-                      <a:off x="0" y="0"/>
-                      <a:ext cx="4680000" cy="3510000"/>
-                    </a:xfrm>
-                    <a:prstGeom prst="rect"/>
-                  </pic:spPr>
-                </pic:pic>
-              </a:graphicData>
-            </a:graphic>
-          </wp:inline>
-        </w:drawing>
-      </w:r>
-    </w:p>
-    <w:p>
-      <w:pPr>
-        <w:spacing w:after="200"/>
-        <w:jc w:val="center"/>
-      </w:pPr>
-      <w:r>
-        <w:rPr>
-          <w:rFonts w:ascii="Times New Roman" w:hAnsi="Times New Roman" w:eastAsia="宋体"/>
-          <w:b w:val="0"/>
-          <w:sz w:val="18"/>
-        </w:rPr>
-        <w:t>图 7  GSE33630 中风险评分病理类型梯度（Kruskal-Wallis P = 1.75e-12）</w:t>
+        <w:t>ssGSEA 显示 28 种免疫细胞的相对富集评分中 25 种（89.3%）在高、低风险组间差异显著（FDR &lt; 0.05），高风险组 Th1、滤泡辅助 T 细胞、Th2 及活化 CD8 T 细胞等富集，免疫检查点标志物中 PD-L1（FDR = 3.3×10⁻¹⁴）、PD-L2（FDR = 2.8×10⁻⁹）、SIGLEC15、CD80、CTLA-4、TIGIT、CD86、TIM-3、TNFRSF9 等 9 个 FDR &lt; 0.05。需注意：ssGSEA 为转录组相对富集推断，不等同于绝对浸润，未校正肿瘤纯度/亚型/驱动突变，高、低风险组基于同一数据定义存在数据驱动偏倚，结果均为计算推断、假设生成性质；完整热图与箱线图见补充材料 4（补充图 4–5）。</w:t>
       </w:r>
     </w:p>
     <w:p>
@@ -939,7 +913,7 @@
           <w:b/>
           <w:sz w:val="24"/>
         </w:rPr>
-        <w:t>3.6  免疫浸润分析</w:t>
+        <w:t>3.7  药物敏感性分析（计算推断，详见补充材料 4）</w:t>
       </w:r>
     </w:p>
     <w:p>
@@ -953,246 +927,7 @@
           <w:b w:val="0"/>
           <w:sz w:val="22"/>
         </w:rPr>
-        <w:t>ssGSEA 显示 28 种免疫细胞的相对富集评分中 25 种（89.3%）在高、低风险组间的差异显著（FDR &lt; 0.05）。高风险组中 1 型 T 辅助细胞（P = 6.4×10⁻⁵）、滤泡辅助 T 细胞（P = 1.9×10⁻⁴）、Th2 细胞及活化 CD8 T 细胞等显著富集，提示高风险组肿瘤微环境呈免疫激活与炎症特征。免疫检查点标志物分析显示（FDR 基于15 个检查点基因全集 BH 校正），高风险组 PD-L1（CD274，FDR = 3.3×10⁻¹⁴）、PD-L2（PDCD1LG2，FDR = 2.8×10⁻⁹）、SIGLEC15（FDR = 4.1×10⁻¹¹）、CD80（FDR = 4.1×10⁻¹¹）、CTLA-4（FDR = 1.9×10⁻⁷）、TIGIT（FDR = 2.9×10⁻⁷）、CD86（FDR = 3.7×10⁻⁷）、TIM-3（HAVCR2，FDR = 1.9×10⁻⁶）、TNFRSF9（FDR = 1.0×10⁻⁷）表达显著上调。需注意：ssGSEA 评分为转录组相对富集推断，不等同于免疫细胞绝对浸润比例，且本分析未校正肿瘤纯度、甲状腺癌亚型与驱动突变状态（详见 4.7），高、低风险组基于同一数据定义，存在数据驱动偏倚。</w:t>
-      </w:r>
-    </w:p>
-    <w:p>
-      <w:pPr>
-        <w:jc w:val="center"/>
-      </w:pPr>
-      <w:r>
-        <w:drawing>
-          <wp:inline xmlns:a="http://schemas.openxmlformats.org/drawingml/2006/main" xmlns:pic="http://schemas.openxmlformats.org/drawingml/2006/picture">
-            <wp:extent cx="5040000" cy="4581818"/>
-            <wp:docPr id="8" name="Picture 8"/>
-            <wp:cNvGraphicFramePr>
-              <a:graphicFrameLocks noChangeAspect="1"/>
-            </wp:cNvGraphicFramePr>
-            <a:graphic>
-              <a:graphicData uri="http://schemas.openxmlformats.org/drawingml/2006/picture">
-                <pic:pic>
-                  <pic:nvPicPr>
-                    <pic:cNvPr id="0" name="fig7_immune_heatmap.png"/>
-                    <pic:cNvPicPr/>
-                  </pic:nvPicPr>
-                  <pic:blipFill>
-                    <a:blip r:embed="rId16"/>
-                    <a:stretch>
-                      <a:fillRect/>
-                    </a:stretch>
-                  </pic:blipFill>
-                  <pic:spPr>
-                    <a:xfrm>
-                      <a:off x="0" y="0"/>
-                      <a:ext cx="5040000" cy="4581818"/>
-                    </a:xfrm>
-                    <a:prstGeom prst="rect"/>
-                  </pic:spPr>
-                </pic:pic>
-              </a:graphicData>
-            </a:graphic>
-          </wp:inline>
-        </w:drawing>
-      </w:r>
-    </w:p>
-    <w:p>
-      <w:pPr>
-        <w:spacing w:after="200"/>
-        <w:jc w:val="center"/>
-      </w:pPr>
-      <w:r>
-        <w:rPr>
-          <w:rFonts w:ascii="Times New Roman" w:hAnsi="Times New Roman" w:eastAsia="宋体"/>
-          <w:b w:val="0"/>
-          <w:sz w:val="18"/>
-        </w:rPr>
-        <w:t>图 8  28 种免疫细胞 ssGSEA 相对富集热图（按 FDR 排序；红色：高风险组）</w:t>
-      </w:r>
-    </w:p>
-    <w:p>
-      <w:pPr>
-        <w:jc w:val="center"/>
-      </w:pPr>
-      <w:r>
-        <w:drawing>
-          <wp:inline xmlns:a="http://schemas.openxmlformats.org/drawingml/2006/main" xmlns:pic="http://schemas.openxmlformats.org/drawingml/2006/picture">
-            <wp:extent cx="5040000" cy="3780000"/>
-            <wp:docPr id="9" name="Picture 9"/>
-            <wp:cNvGraphicFramePr>
-              <a:graphicFrameLocks noChangeAspect="1"/>
-            </wp:cNvGraphicFramePr>
-            <a:graphic>
-              <a:graphicData uri="http://schemas.openxmlformats.org/drawingml/2006/picture">
-                <pic:pic>
-                  <pic:nvPicPr>
-                    <pic:cNvPr id="0" name="fig8_immune_boxplot.png"/>
-                    <pic:cNvPicPr/>
-                  </pic:nvPicPr>
-                  <pic:blipFill>
-                    <a:blip r:embed="rId17"/>
-                    <a:stretch>
-                      <a:fillRect/>
-                    </a:stretch>
-                  </pic:blipFill>
-                  <pic:spPr>
-                    <a:xfrm>
-                      <a:off x="0" y="0"/>
-                      <a:ext cx="5040000" cy="3780000"/>
-                    </a:xfrm>
-                    <a:prstGeom prst="rect"/>
-                  </pic:spPr>
-                </pic:pic>
-              </a:graphicData>
-            </a:graphic>
-          </wp:inline>
-        </w:drawing>
-      </w:r>
-    </w:p>
-    <w:p>
-      <w:pPr>
-        <w:spacing w:after="200"/>
-        <w:jc w:val="center"/>
-      </w:pPr>
-      <w:r>
-        <w:rPr>
-          <w:rFonts w:ascii="Times New Roman" w:hAnsi="Times New Roman" w:eastAsia="宋体"/>
-          <w:b w:val="0"/>
-          <w:sz w:val="18"/>
-        </w:rPr>
-        <w:t>图 9  代表性免疫细胞组间相对富集差异箱线图</w:t>
-      </w:r>
-    </w:p>
-    <w:p>
-      <w:pPr>
-        <w:spacing w:before="200" w:after="120"/>
-      </w:pPr>
-      <w:r>
-        <w:rPr>
-          <w:rFonts w:ascii="Times New Roman" w:hAnsi="Times New Roman" w:eastAsia="黑体"/>
-          <w:b/>
-          <w:sz w:val="24"/>
-        </w:rPr>
-        <w:t>3.7  药物敏感性分析</w:t>
-      </w:r>
-    </w:p>
-    <w:p>
-      <w:pPr>
-        <w:spacing w:after="120"/>
-        <w:ind w:firstLine="440"/>
-      </w:pPr>
-      <w:r>
-        <w:rPr>
-          <w:rFonts w:ascii="Times New Roman" w:hAnsi="Times New Roman" w:eastAsia="宋体"/>
-          <w:b w:val="0"/>
-          <w:sz w:val="22"/>
-        </w:rPr>
-        <w:t>基于 GDSC2 计算预测 409 例患者对 198 种药物的 IC50，176 种药物（88.9%）在高、低风险组间差异显著（FDR &lt; 0.05）。高风险组对其中 158 种药物预测 IC50 更高（更耐药）、仅 18 种更低（更敏感），整体呈计算预测的耐药特征。高风险组对多种细胞毒化疗药物预测耐药：5-氟尿嘧啶（High 181.1 vs Low 113.2，FDR = 1.6×10⁻¹¹）、紫杉醇（0.085 vs 0.059，FDR = 9.5×10⁻¹²）、多西他赛（0.013 vs 0.010，FDR = 6.4×10⁻⁸）、喜树碱（0.122 vs 0.103，FDR = 2.6×10⁻⁴）、顺铂（33.8 vs 29.3，FDR = 0.0086）、长春碱（0.031 vs 0.023，FDR = 6.7×10⁻⁶）、YK-4-279（11.6 vs 9.6，FDR = 8.5×10⁻⁵）；对部分靶向药物亦预测耐药：PRMT5 抑制剂 GSK591（115.5 vs 88.3，FDR = 8.8×10⁻¹⁶）、ATR 抑制剂 VE821（80.8 vs 55.2，FDR = 3.3×10⁻¹⁵）、NAMPT 抑制剂 Daporinad（0.016 vs 0.012，FDR = 5.5×10⁻¹¹）；仅 Selumetinib（60.2 vs 98.6，FDR = 5.3×10⁻¹⁴）、ATM 抑制剂 KU-55933（88.9 vs 90.5，FDR = 0.0043）等少数药物预测更敏感。预测可靠性评估：（1）12 个代表性药物 5 折交叉验证（ridge，log IC50 尺度）R² 中位数 0.350（范围 0.080-0.430），RMSE 中位数 1.478；（2）组标签置换检验（B = 500 次）中，FDR &lt; 0.05 显著药物数的零分布中位数为 0.62（最大值 82），实际观察值 176 远超随机期望（P &lt; 0.002），表明组间差异并非单纯由药物间相关性所致。需注意：药物间 IC50 高度相关，独立 FDR 校正可能仍高估显著药物数量；上述结果均为基于细胞系模型的计算推断、假设生成性质，未经实验验证。</w:t>
-      </w:r>
-    </w:p>
-    <w:p>
-      <w:pPr>
-        <w:jc w:val="center"/>
-      </w:pPr>
-      <w:r>
-        <w:drawing>
-          <wp:inline xmlns:a="http://schemas.openxmlformats.org/drawingml/2006/main" xmlns:pic="http://schemas.openxmlformats.org/drawingml/2006/picture">
-            <wp:extent cx="5040000" cy="3665455"/>
-            <wp:docPr id="10" name="Picture 10"/>
-            <wp:cNvGraphicFramePr>
-              <a:graphicFrameLocks noChangeAspect="1"/>
-            </wp:cNvGraphicFramePr>
-            <a:graphic>
-              <a:graphicData uri="http://schemas.openxmlformats.org/drawingml/2006/picture">
-                <pic:pic>
-                  <pic:nvPicPr>
-                    <pic:cNvPr id="0" name="fig9_drug_volcano.png"/>
-                    <pic:cNvPicPr/>
-                  </pic:nvPicPr>
-                  <pic:blipFill>
-                    <a:blip r:embed="rId18"/>
-                    <a:stretch>
-                      <a:fillRect/>
-                    </a:stretch>
-                  </pic:blipFill>
-                  <pic:spPr>
-                    <a:xfrm>
-                      <a:off x="0" y="0"/>
-                      <a:ext cx="5040000" cy="3665455"/>
-                    </a:xfrm>
-                    <a:prstGeom prst="rect"/>
-                  </pic:spPr>
-                </pic:pic>
-              </a:graphicData>
-            </a:graphic>
-          </wp:inline>
-        </w:drawing>
-      </w:r>
-    </w:p>
-    <w:p>
-      <w:pPr>
-        <w:spacing w:after="200"/>
-        <w:jc w:val="center"/>
-      </w:pPr>
-      <w:r>
-        <w:rPr>
-          <w:rFonts w:ascii="Times New Roman" w:hAnsi="Times New Roman" w:eastAsia="宋体"/>
-          <w:b w:val="0"/>
-          <w:sz w:val="18"/>
-        </w:rPr>
-        <w:t>图 10  药物敏感性火山图（红色：高风险组预测耐药 158 种；蓝色：预测敏感 18 种）</w:t>
-      </w:r>
-    </w:p>
-    <w:p>
-      <w:pPr>
-        <w:jc w:val="center"/>
-      </w:pPr>
-      <w:r>
-        <w:drawing>
-          <wp:inline xmlns:a="http://schemas.openxmlformats.org/drawingml/2006/main" xmlns:pic="http://schemas.openxmlformats.org/drawingml/2006/picture">
-            <wp:extent cx="5400000" cy="3323077"/>
-            <wp:docPr id="11" name="Picture 11"/>
-            <wp:cNvGraphicFramePr>
-              <a:graphicFrameLocks noChangeAspect="1"/>
-            </wp:cNvGraphicFramePr>
-            <a:graphic>
-              <a:graphicData uri="http://schemas.openxmlformats.org/drawingml/2006/picture">
-                <pic:pic>
-                  <pic:nvPicPr>
-                    <pic:cNvPr id="0" name="fig10_drug_boxplot.png"/>
-                    <pic:cNvPicPr/>
-                  </pic:nvPicPr>
-                  <pic:blipFill>
-                    <a:blip r:embed="rId19"/>
-                    <a:stretch>
-                      <a:fillRect/>
-                    </a:stretch>
-                  </pic:blipFill>
-                  <pic:spPr>
-                    <a:xfrm>
-                      <a:off x="0" y="0"/>
-                      <a:ext cx="5400000" cy="3323077"/>
-                    </a:xfrm>
-                    <a:prstGeom prst="rect"/>
-                  </pic:spPr>
-                </pic:pic>
-              </a:graphicData>
-            </a:graphic>
-          </wp:inline>
-        </w:drawing>
-      </w:r>
-    </w:p>
-    <w:p>
-      <w:pPr>
-        <w:spacing w:after="200"/>
-        <w:jc w:val="center"/>
-      </w:pPr>
-      <w:r>
-        <w:rPr>
-          <w:rFonts w:ascii="Times New Roman" w:hAnsi="Times New Roman" w:eastAsia="宋体"/>
-          <w:b w:val="0"/>
-          <w:sz w:val="18"/>
-        </w:rPr>
-        <w:t>图 11  代表性药物预测 IC50 组间比较箱线图</w:t>
+        <w:t>基于 GDSC2 计算预测 409 例患者对 198 种药物的 IC50，176 种（88.9%）组间差异显著（FDR &lt; 0.05），高风险组对 158 种预测更耐药、仅 18 种更敏感，整体呈计算预测的耐药特征；代表药物包括 5-氟尿嘧啶（FDR = 1.6×10⁻¹¹）、紫杉醇（FDR = 9.5×10⁻¹²）、GSK591（FDR = 8.8×10⁻¹⁶）、VE821（FDR = 3.3×10⁻¹⁵）等耐药，仅 Selumetinib（FDR = 5.3×10⁻¹⁴）、KU-55933（FDR = 0.0043）等少数预测敏感。可靠性评估：12 个代表药物（覆盖细胞毒与靶向机制）5 折交叉验证 R² 中位数 0.350（范围 0.080–0.430）、RMSE 中位数 1.478；组标签置换（B = 500 次）显示实际显著药数176 远超随机期望（零分布中位数 0.62、最大值 82，P &lt; 0.002）。需注意：药物间 IC50高度相关、独立 FDR 可能高估显著药物数；结果均为基于细胞系模型的计算推断、假设生成性质，未经实验验证；完整火山图、箱线图与逐药数值见补充材料 4（补充图 6–7、补充表）。</w:t>
       </w:r>
     </w:p>
     <w:p>
@@ -1260,7 +995,7 @@
           <w:b w:val="0"/>
           <w:sz w:val="22"/>
         </w:rPr>
-        <w:t>就 MVMR 而言，既往性激素-甲状腺癌 MR 研究总体未发现强因果关联（Chen 等 2026 报告总睾酮、SHBG、雌二醇均无显著因果关联；Xu 等 2025 报告生物可利用睾酮仅在女性中呈提示性保护），本研究在校正 BMI 与总睾酮（ebi-a-GCST90014013）后TSH 保护效应方向仍一致（MVMR OR = 0.525，95% CI 0.317–0.869，P = 0.0123），BMI（P = 0.859）与睾酮（P = 0.613）无独立显著效应。需诚实说明：条件 F 统计量显示BMI（F = 5.66）与睾酮（F = 3.38）的条件工具强度不足（小于 10），且 MVMR 异质性 Q 统计量显著（Q = 244.76，df = 50，P = 1.81×10⁻²⁷），提示弱工具与水平多效性可能影响 MVMR 估计；以 Q 统计量最小化方法复核 TSH 方向一致（b = −0.628），但 BMI/睾酮的效应估计应视为不可靠。因此，本研究证据不足以断言 TSH 效应独立于 BMI 与性激素水平。</w:t>
+        <w:t>就 MVMR 而言，既往性激素-甲状腺癌 MR 研究总体未发现强因果关联（Chen 等 2026 报告总睾酮、SHBG、雌二醇均无显著因果关联；Xu 等 2025 报告生物可利用睾酮仅在女性中呈提示性保护），本研究在校正 BMI 与总睾酮（ebi-a-GCST90014013）后TSH 保护效应方向仍一致（MVMR OR = 0.525，95% CI 0.317–0.869，P = 0.0123），BMI（P = 0.859）与睾酮（P = 0.613）未显示独立效应。需诚实说明：条件 F 统计量显示BMI（F = 5.66）与睾酮（F = 3.38）的条件工具强度不足（小于 10），且 MVMR 异质性 Q 统计量显著（Q = 244.76，df = 50，P = 1.81×10⁻²⁷），提示弱工具与水平多效性可能影响 MVMR 估计；以 Q 统计量最小化方法复核 TSH 方向一致（b = −0.628，95% CI −1.203 至 −0.193），但 BMI（95% CI −9.059 至 3.277）与睾酮（95% CI −6.003 至 19.826）的效应估计置信区间极宽，应视为不可靠。因此但 BMI/睾酮的效应估计应视为不可靠。因此，本研究证据不足以断言 TSH 效应独立于 BMI 与性激素水平。</w:t>
       </w:r>
     </w:p>
     <w:p>
@@ -1409,7 +1144,7 @@
           <w:b w:val="0"/>
           <w:sz w:val="22"/>
         </w:rPr>
-        <w:t>本研究的 MR 结果与既往观察性流行病学证据方向一致，并在两个独立复制结局及多变量校正后保持方向稳健。预后评分的基因选择与既往甲状腺癌转录组研究对 GNG7 的相关报道相呼应；免疫浸润与药物敏感性结果则为后续机制研究与治疗假设的生成提供了方向（均为计算推断，须经实验验证）。需要强调，当前评分仅显示初步的区分趋势，其 95% 置信区间下限（0.559）接近随机水平，且未经独立生存队列验证，尚不足以支持任何临床决策。</w:t>
+        <w:t>本研究的 MR 结果与既往观察性流行病学证据方向一致，并在两个独立复制结局及多变量校正后保持方向稳健。预后评分的基因选择与既往甲状腺癌转录组研究对 GNG7 的相关报道相呼应；免疫浸润与药物敏感性结果则为后续机制研究与治疗假设的生成提供了方向（均为计算推断，须经实验验证）。需要强调，当前评分为样本外负结果（重复交叉验证 C-index 0.334 低于随机水平），其训练队列 C-index 0.666 的 95% 置信区间下限（0.559）接近随机水平，且未经独立生存队列验证，尚不足以支持任何临床决策。</w:t>
       </w:r>
     </w:p>
     <w:p>
@@ -1436,7 +1171,7 @@
           <w:b w:val="0"/>
           <w:sz w:val="22"/>
         </w:rPr>
-        <w:t>本研究存在以下局限性：（1）候选基因评分尚未在任何独立队列完成生存终点验证——我们已系统检索公共 GEO 甲状腺癌队列（含 GSE60542、GSE29265），确认这些数据集均为组织表达数据、不含生存随访信息，故仅能进行病理类型梯度验证，这是评分转化价值的主要限制之一；（2）评分训练队列仅 27 例事件（EPV ≈ 13.5），过拟合风险较高，C-index 0.666 属中等区分能力，乐观校正后为 0.662，95% CI 下限 0.559 接近随机水平，5 年 AUC = 0.593 亦接近随机猜测，Bootstrap 变量选择保留频率有限（GNG7 151/200（75.5%）、NFIA 113/200（56.5%）），故评分仅显示初步区分趋势，仅定位为探索性分析；（3）MR 分析基于欧洲人群 GWAS，结论向其他人群外推需谨慎；主分析 Cochran Q 异质性（P = 1.99×10⁻²⁷，I² = 75.7%）与 MR-PRESSO 全局检验（P &lt; 1×10⁻⁴）均显著，提示工具变量间存在异质性/多效性，尽管失真检验（P = 0.119）、MR-Egger 截距（P = 0.906）与 MR-PRESSO 校正估计、MR-RAPS 均支持方向不变，该残余异质性仍构成 MR 结论的固有局限；（4）MVMR 中 BMI 与睾酮条件 F 统计量低于 10（弱工具）、条件异质性 Q 显著（P = 1.81×10⁻²⁷），BMI/睾酮效应估计不可靠，TSH 直接效应虽显著但其精确性受上述因素制约，故本研究不足以断言 TSH 效应独立于BMI 与性激素；（5）变量选择：Lasso-Cox 仅 lambda.min 路径保留 GNG7/NFIA 等 43 个变量，lambda.1se 与弹性网路径均为 0 变量，正则化选择结果不稳定、模型系数不确定性大；（6）药物敏感性为基于细胞系模型的计算预测、假设生成性质，未经体内外实验验证，训练集交叉验证 R² 中位数 0.350 提示拟合有限，且药物间 IC50 高度相关、独立 FDR 可能高估显著药物数量（虽置换检验显示组间差异显著超出随机期望）；（7）免疫浸润为转录组相对富集推断，未经蛋白水平验证，未用去卷积方法交叉验证，未校正肿瘤纯度、亚型与 BRAF/RAS 突变状态，高/低风险组基于同一数据定义存在数据驱动偏倚；（8）决策曲线分析显示评分仅在低阈值区间（0.01、0.02、0.04–0.08）净获益为正；（9）校准曲线在仅 27 例事件下表现良好，不能排除过拟合导致的校准乐观；（10）受限于回顾性 TCGA 数据，本评分未纳入 TSH 抑制治疗记录（TRIPOD+AI 条目 6c），治疗暴露对预后分层的影响无法评估；（11）MR 证据在不同工具变量集与结局定义下方向不完全一致（含一项已撤稿研究），该异质性本身值得进一步研究；（12）反向 MR因甲状腺癌结局 GWAS 缺乏全基因组显著的独立工具 SNP（主结局仅 1054 例病例）而未执行；共定位（colocalization）需要暴露 GWAS 完整区域的汇总统计量，而 Zhou 等（2020）公开数据仅含筛选后的工具位点，无法进行标准共定位分析，eQTL-MR 亦未执行，故工具 SNP 与候选基因的功能关联仅停留在基因组定位层面；（13）未评估暴露与结局 GWAS 之间的样本重叠程度（主结局 UKB 相关数据集与 BMI/睾酮 UKB 数据存在潜在重叠），样本重叠可能引入偏倚；（14）未按甲状腺癌亚型（PTC、FTC、ATC、MTC）及性别分层分析，亚型与性别相关异质性可能未被捕获。</w:t>
+        <w:t>本研究存在以下局限性：（1）候选基因评分尚未在任何独立队列完成生存终点验证——我们已系统检索公共 GEO 甲状腺癌队列（含 GSE60542、GSE29265），确认这些数据集均为组织表达数据、不含生存随访信息，故仅能进行病理类型梯度验证，这是评分转化价值的主要限制之一；（2）评分训练队列仅 27 例事件（EPV ≈ 13.5），过拟合风险较高，C-index 0.666 属中等区分能力，乐观校正后为 0.662，95% CI 下限 0.559 接近随机水平，5 年 AUC = 0.593 亦接近随机猜测，Bootstrap 变量选择保留频率有限（GNG7 151/200（75.5%）、NFIA 113/200（56.5%）），故评分仅显示初步区分趋势，仅定位为探索性分析；（3）MR 分析基于欧洲人群 GWAS，结论向其他人群外推需谨慎；主分析 Cochran Q 异质性（P = 1.99×10⁻²⁷，I² = 75.7%）与 MR-PRESSO 全局检验（P &lt; 1×10⁻⁴）均显著，提示工具变量间存在异质性/多效性，尽管失真检验（P = 0.119）、MR-Egger 截距（P = 0.906）与 MR-PRESSO 校正估计、MR-RAPS 均支持方向不变，该残余异质性仍构成 MR 结论的固有局限；（4）MVMR 中 BMI 与睾酮条件 F 统计量低于 10（弱工具）、条件异质性 Q 显著（P = 1.81×10⁻²⁷），BMI/睾酮效应估计不可靠，TSH 直接效应方向虽一致但其精确性受上述因素制约，故本研究不足以断言 TSH 效应独立于BMI 与性激素；（5）变量选择：Lasso-Cox 仅 lambda.min 路径保留 GNG7/NFIA 等 43 个变量，lambda.1se 与弹性网路径均为 0 变量，正则化选择结果不稳定、模型系数不确定性大；（6）药物敏感性为基于细胞系模型的计算预测、假设生成性质，未经体内外实验验证，训练集交叉验证 R² 中位数 0.350 提示拟合有限，且药物间 IC50 高度相关、独立 FDR 可能高估显著药物数量（虽置换检验显示组间差异显著超出随机期望）；（7）免疫浸润为转录组相对富集推断，未经蛋白水平验证，未用去卷积方法交叉验证，未校正肿瘤纯度、亚型与 BRAF/RAS 突变状态，高/低风险组基于同一数据定义存在数据驱动偏倚；（8）决策曲线分析显示评分仅在低阈值区间（0.01、0.02、0.04–0.08）净获益为正；（9）校准曲线在仅 27 例事件下表现良好，不能排除过拟合导致的校准乐观；（10）受限于回顾性 TCGA 数据，本评分未纳入 TSH 抑制治疗记录（TRIPOD+AI 条目 6c），治疗暴露对预后分层的影响无法评估；（11）MR 证据在不同工具变量集与结局定义下方向不完全一致（含一项已撤稿研究），该异质性本身值得进一步研究；（12）反向 MR因甲状腺癌结局 GWAS 缺乏全基因组显著的独立工具 SNP（主结局仅 1054 例病例）而未执行；共定位（colocalization）需要暴露 GWAS 完整区域的汇总统计量，而 Zhou 等（2020）公开数据仅含筛选后的工具位点，无法进行标准共定位分析，eQTL-MR 亦未执行，故工具 SNP 与候选基因的功能关联仅停留在基因组定位层面；（13）未评估暴露与结局 GWAS 之间的样本重叠程度（主结局 UKB 相关数据集与 BMI/睾酮 UKB 数据存在潜在重叠），样本重叠可能引入偏倚；（14）未按甲状腺癌亚型（PTC、FTC、ATC、MTC）及性别分层分析，亚型与性别相关异质性可能未被捕获。</w:t>
       </w:r>
     </w:p>
     <w:p>
@@ -1490,7 +1225,7 @@
           <w:b w:val="0"/>
           <w:sz w:val="22"/>
         </w:rPr>
-        <w:t>数据可用性声明：暴露 GWAS（Zhou 等，2020）与结局 GWAS（ebi-a-GCST90018929、ebi-a-GCST90013867、finn-b-C3_THYROID_GLAND）汇总统计量均来自 IEU OpenGWAS 数据库（https://gwas.mrcieu.ac.uk/）；TCGA-THY 表达与临床数据来自 TCGA/GDC 公共数据库；外部验证表达数据来自 NCBI GEO（GSE33630）；药物敏感性训练数据使用 GDSC2（805 细胞系 × 198 药物）。全部 13 个分析脚本（脚本 A–K 及脚本 L，含 MR 敏感性二轮补跑、MVMR 条件检验、Lasso/弹性网重跑、Bootstrap 稳定性、药敏交叉验证与置换检验）已整理为可复现脚本包，完整代码公开于 GitHub （https://github.com/qwe2412/TSH-ThyroidCancer-MR，共 9 次提交，含脚本、运行说明、论文构建与发布脚本）；Zenodo 版本 DOI 将于论文接收后经归档补充。工具 SNP 列表与全部敏感性分析输出见补充材料。</w:t>
+        <w:t>数据可用性声明：暴露 GWAS（Zhou 等，2020）与结局 GWAS（ebi-a-GCST90018929、ebi-a-GCST90013867、finn-b-C3_THYROID_GLAND）汇总统计量均来自 IEU OpenGWAS 数据库（https://gwas.mrcieu.ac.uk/）；TCGA-THY 表达与临床数据来自 TCGA/GDC 公共数据库；外部验证表达数据来自 NCBI GEO（GSE33630）；药物敏感性训练数据使用 GDSC2（805 细胞系 × 198 药物）。全部 19 个分析脚本（脚本 01–17 及 12b、15b，含 MR 敏感性二轮补跑、MVMR 条件检验与 qhet 置信区间重跑、Lasso/弹性网重跑、Bootstrap 稳定性、药敏交叉验证与置换检验）已整理为可复现脚本包，完整代码公开于 GitHub （https://github.com/qwe2412/TSH-ThyroidCancer-MR，共 11 次提交，含脚本、运行说明、论文构建与发布脚本）；Zenodo 版本 DOI 将于论文接收后经归档补充。工具 SNP 列表与全部敏感性分析输出见补充材料。</w:t>
       </w:r>
     </w:p>
     <w:p>

</xml_diff>